<commit_message>
Merge independent claim into seven steps and fix claim 3 dimensions.
Fold the second-stage start into S6 and return from S7 to that pouring
step. Redefine η as displacement per 1 m³ of wet-joint concrete so
δ_j = δ + Σ(V·η) is dimensionally consistent.

Co-authored-by: 2427613265-ai <2427613265-ai@users.noreply.github.com>
</commit_message>
<xml_diff>
--- a/docs/PA26-1238-I-A_权利要求书优化稿.docx
+++ b/docs/PA26-1238-I-A_权利要求书优化稿.docx
@@ -735,7 +735,7 @@
           <w:sz w:val="28"/>
           <w:szCs w:val="28"/>
         </w:rPr>
-        <w:t>S6、判断所述第一阶段的湿接缝混凝土是否达到预设强度，若否，待所述湿接缝混凝土达到预设强度后进入步骤S7；若是，进入步骤S7；</w:t>
+        <w:t>S6、判断所述第一阶段的湿接缝混凝土是否达到预设强度，若否，待所述湿接缝混凝土达到预设强度后开始第二阶段浇筑；若是，开始第二阶段浇筑；所述第二阶段由跨中向两侧索塔对称浇筑第N浇筑批次的所述吊索区湿接缝；其中，N≥1，N为正整数，N的起始值为1；</w:t>
       </w:r>
     </w:p>
     <w:p>
@@ -757,7 +757,7 @@
           <w:sz w:val="28"/>
           <w:szCs w:val="28"/>
         </w:rPr>
-        <w:t>S7、开始第二阶段浇筑，由跨中向两侧索塔对称浇筑第N浇筑批次的所述吊索区湿接缝；其中，N≥1，N为正整数，N的起始值为1；</w:t>
+        <w:t>S7、判断第N浇筑批次完成后是否仍存在尚未浇筑的吊索区湿接缝，若是，将N+1赋值给N，返回步骤S6中所述第二阶段浇筑；若否，全桥湿接缝浇筑完成，形成组合截面。</w:t>
       </w:r>
     </w:p>
     <w:p>
@@ -773,14 +773,6 @@
           <w:szCs w:val="28"/>
         </w:rPr>
       </w:pPr>
-      <w:r>
-        <w:rPr>
-          <w:rFonts w:hint="eastAsia" w:ascii="Times New Roman" w:hAnsi="Times New Roman" w:eastAsia="楷体" w:cs="Times New Roman"/>
-          <w:sz w:val="28"/>
-          <w:szCs w:val="28"/>
-        </w:rPr>
-        <w:t>S8、判断第N浇筑批次完成后是否仍存在尚未浇筑的吊索区湿接缝，若是，将N+1赋值给N，返回步骤S7；若否，全桥湿接缝浇筑完成，形成组合截面。</w:t>
-      </w:r>
     </w:p>
     <w:p>
       <w:pPr>
@@ -795,6 +787,14 @@
           <w:szCs w:val="28"/>
         </w:rPr>
       </w:pPr>
+      <w:r>
+        <w:rPr>
+          <w:rFonts w:hint="eastAsia" w:ascii="Times New Roman" w:hAnsi="Times New Roman" w:eastAsia="楷体" w:cs="Times New Roman"/>
+          <w:sz w:val="28"/>
+          <w:szCs w:val="28"/>
+        </w:rPr>
+        <w:t>2.根据权利要求1所述的悬索桥钢混组合梁原位叠合浇筑施工方法，其特征在于，所述S3中先浇筑预设跨中区段的所述非吊索区湿接缝包括以下步骤：</w:t>
+      </w:r>
     </w:p>
     <w:p>
       <w:pPr>
@@ -815,7 +815,81 @@
           <w:sz w:val="28"/>
           <w:szCs w:val="28"/>
         </w:rPr>
-        <w:t>2.根据权利要求1所述的悬索桥钢混组合梁原位叠合浇筑施工方法，其特征在于，所述S3中先浇筑预设跨中区段的所述非吊索区湿接缝包括以下步骤：</w:t>
+        <w:t>S31、以主缆跨中为起点，在浇筑前获得初始主缆水平张力</w:t>
+      </w:r>
+      <m:oMath>
+        <m:sSub>
+          <m:sSubPr>
+            <m:ctrlPr>
+              <w:rPr>
+                <w:rFonts w:hint="eastAsia" w:ascii="DejaVu Math TeX Gyre" w:hAnsi="DejaVu Math TeX Gyre" w:eastAsia="楷体" w:cs="Times New Roman"/>
+                <w:i w:val="0"/>
+                <w:sz w:val="28"/>
+                <w:szCs w:val="28"/>
+                <w:highlight w:val="none"/>
+                <w:lang w:eastAsia="zh-CN"/>
+              </w:rPr>
+            </m:ctrlPr>
+          </m:sSubPr>
+          <m:e>
+            <m:r>
+              <m:rPr>
+                <m:sty m:val="p"/>
+              </m:rPr>
+              <w:rPr>
+                <w:rFonts w:hint="eastAsia" w:ascii="DejaVu Math TeX Gyre" w:hAnsi="DejaVu Math TeX Gyre" w:eastAsia="楷体" w:cs="Times New Roman"/>
+                <w:sz w:val="28"/>
+                <w:szCs w:val="28"/>
+                <w:highlight w:val="none"/>
+                <w:lang w:eastAsia="zh-CN"/>
+              </w:rPr>
+              <m:t>H</m:t>
+            </m:r>
+            <m:ctrlPr>
+              <w:rPr>
+                <w:rFonts w:hint="eastAsia" w:ascii="DejaVu Math TeX Gyre" w:hAnsi="DejaVu Math TeX Gyre" w:eastAsia="楷体" w:cs="Times New Roman"/>
+                <w:i w:val="0"/>
+                <w:sz w:val="28"/>
+                <w:szCs w:val="28"/>
+                <w:highlight w:val="none"/>
+                <w:lang w:eastAsia="zh-CN"/>
+              </w:rPr>
+            </m:ctrlPr>
+          </m:e>
+          <m:sub>
+            <m:r>
+              <m:rPr>
+                <m:sty m:val="p"/>
+              </m:rPr>
+              <w:rPr>
+                <w:rFonts w:hint="eastAsia" w:ascii="DejaVu Math TeX Gyre" w:hAnsi="DejaVu Math TeX Gyre" w:eastAsia="楷体" w:cs="Times New Roman"/>
+                <w:sz w:val="28"/>
+                <w:szCs w:val="28"/>
+                <w:highlight w:val="none"/>
+                <w:lang w:eastAsia="zh-CN"/>
+              </w:rPr>
+              <m:t>0</m:t>
+            </m:r>
+            <m:ctrlPr>
+              <w:rPr>
+                <w:rFonts w:hint="eastAsia" w:ascii="DejaVu Math TeX Gyre" w:hAnsi="DejaVu Math TeX Gyre" w:eastAsia="楷体" w:cs="Times New Roman"/>
+                <w:i w:val="0"/>
+                <w:sz w:val="28"/>
+                <w:szCs w:val="28"/>
+                <w:highlight w:val="none"/>
+                <w:lang w:eastAsia="zh-CN"/>
+              </w:rPr>
+            </m:ctrlPr>
+          </m:sub>
+        </m:sSub>
+      </m:oMath>
+      <w:r>
+        <w:rPr>
+          <w:rFonts w:hint="eastAsia" w:ascii="Times New Roman" w:hAnsi="Times New Roman" w:eastAsia="楷体" w:cs="Times New Roman"/>
+          <w:sz w:val="28"/>
+          <w:szCs w:val="28"/>
+        </w:rPr>
+        <w:t>，并令q≥1，q为正整数，q的起始值为1；</w:t>
       </w:r>
     </w:p>
     <w:p>
@@ -837,7 +911,7 @@
           <w:sz w:val="28"/>
           <w:szCs w:val="28"/>
         </w:rPr>
-        <w:t>S31、以主缆跨中为起点，在浇筑前获得初始主缆水平张力</w:t>
+        <w:t>S32、向两侧索塔方向对称选取第q次尚未浇筑的非吊索区湿接缝并浇筑，获得浇筑后的当前主缆水平张力</w:t>
       </w:r>
       <m:oMath>
         <m:sSub>
@@ -884,13 +958,13 @@
                 <m:sty m:val="p"/>
               </m:rPr>
               <w:rPr>
-                <w:rFonts w:hint="eastAsia" w:ascii="DejaVu Math TeX Gyre" w:hAnsi="DejaVu Math TeX Gyre" w:eastAsia="楷体" w:cs="Times New Roman"/>
-                <w:sz w:val="28"/>
-                <w:szCs w:val="28"/>
-                <w:highlight w:val="none"/>
-                <w:lang w:eastAsia="zh-CN"/>
-              </w:rPr>
-              <m:t>0</m:t>
+                <w:rFonts w:hint="default" w:ascii="DejaVu Math TeX Gyre" w:hAnsi="DejaVu Math TeX Gyre" w:eastAsia="楷体" w:cs="Times New Roman"/>
+                <w:sz w:val="28"/>
+                <w:szCs w:val="28"/>
+                <w:highlight w:val="none"/>
+                <w:lang w:val="en-US" w:eastAsia="zh-CN"/>
+              </w:rPr>
+              <m:t>1</m:t>
             </m:r>
             <m:ctrlPr>
               <w:rPr>
@@ -911,7 +985,7 @@
           <w:sz w:val="28"/>
           <w:szCs w:val="28"/>
         </w:rPr>
-        <w:t>，并令q≥1，q为正整数，q的起始值为1；</w:t>
+        <w:t>；</w:t>
       </w:r>
     </w:p>
     <w:p>
@@ -933,7 +1007,7 @@
           <w:sz w:val="28"/>
           <w:szCs w:val="28"/>
         </w:rPr>
-        <w:t>S32、向两侧索塔方向对称选取第q次尚未浇筑的非吊索区湿接缝并浇筑，获得浇筑后的当前主缆水平张力</w:t>
+        <w:t>S33、判断(</w:t>
       </w:r>
       <m:oMath>
         <m:sSub>
@@ -1007,7 +1081,155 @@
           <w:sz w:val="28"/>
           <w:szCs w:val="28"/>
         </w:rPr>
-        <w:t>；</w:t>
+        <w:t>−</w:t>
+      </w:r>
+      <m:oMath>
+        <m:sSub>
+          <m:sSubPr>
+            <m:ctrlPr>
+              <w:rPr>
+                <w:rFonts w:hint="eastAsia" w:ascii="DejaVu Math TeX Gyre" w:hAnsi="DejaVu Math TeX Gyre" w:eastAsia="楷体" w:cs="Times New Roman"/>
+                <w:i w:val="0"/>
+                <w:sz w:val="28"/>
+                <w:szCs w:val="28"/>
+                <w:highlight w:val="none"/>
+                <w:lang w:eastAsia="zh-CN"/>
+              </w:rPr>
+            </m:ctrlPr>
+          </m:sSubPr>
+          <m:e>
+            <m:r>
+              <m:rPr>
+                <m:sty m:val="p"/>
+              </m:rPr>
+              <w:rPr>
+                <w:rFonts w:hint="eastAsia" w:ascii="DejaVu Math TeX Gyre" w:hAnsi="DejaVu Math TeX Gyre" w:eastAsia="楷体" w:cs="Times New Roman"/>
+                <w:sz w:val="28"/>
+                <w:szCs w:val="28"/>
+                <w:highlight w:val="none"/>
+                <w:lang w:eastAsia="zh-CN"/>
+              </w:rPr>
+              <m:t>H</m:t>
+            </m:r>
+            <m:ctrlPr>
+              <w:rPr>
+                <w:rFonts w:hint="eastAsia" w:ascii="DejaVu Math TeX Gyre" w:hAnsi="DejaVu Math TeX Gyre" w:eastAsia="楷体" w:cs="Times New Roman"/>
+                <w:i w:val="0"/>
+                <w:sz w:val="28"/>
+                <w:szCs w:val="28"/>
+                <w:highlight w:val="none"/>
+                <w:lang w:eastAsia="zh-CN"/>
+              </w:rPr>
+            </m:ctrlPr>
+          </m:e>
+          <m:sub>
+            <m:r>
+              <m:rPr>
+                <m:sty m:val="p"/>
+              </m:rPr>
+              <w:rPr>
+                <w:rFonts w:hint="eastAsia" w:ascii="DejaVu Math TeX Gyre" w:hAnsi="DejaVu Math TeX Gyre" w:eastAsia="楷体" w:cs="Times New Roman"/>
+                <w:sz w:val="28"/>
+                <w:szCs w:val="28"/>
+                <w:highlight w:val="none"/>
+                <w:lang w:eastAsia="zh-CN"/>
+              </w:rPr>
+              <m:t>0</m:t>
+            </m:r>
+            <m:ctrlPr>
+              <w:rPr>
+                <w:rFonts w:hint="eastAsia" w:ascii="DejaVu Math TeX Gyre" w:hAnsi="DejaVu Math TeX Gyre" w:eastAsia="楷体" w:cs="Times New Roman"/>
+                <w:i w:val="0"/>
+                <w:sz w:val="28"/>
+                <w:szCs w:val="28"/>
+                <w:highlight w:val="none"/>
+                <w:lang w:eastAsia="zh-CN"/>
+              </w:rPr>
+            </m:ctrlPr>
+          </m:sub>
+        </m:sSub>
+      </m:oMath>
+      <w:r>
+        <w:rPr>
+          <w:rFonts w:hint="eastAsia" w:ascii="Times New Roman" w:hAnsi="Times New Roman" w:eastAsia="楷体" w:cs="Times New Roman"/>
+          <w:sz w:val="28"/>
+          <w:szCs w:val="28"/>
+        </w:rPr>
+        <w:t>)/</w:t>
+      </w:r>
+      <m:oMath>
+        <m:sSub>
+          <m:sSubPr>
+            <m:ctrlPr>
+              <w:rPr>
+                <w:rFonts w:hint="eastAsia" w:ascii="DejaVu Math TeX Gyre" w:hAnsi="DejaVu Math TeX Gyre" w:eastAsia="楷体" w:cs="Times New Roman"/>
+                <w:i w:val="0"/>
+                <w:sz w:val="28"/>
+                <w:szCs w:val="28"/>
+                <w:highlight w:val="none"/>
+                <w:lang w:eastAsia="zh-CN"/>
+              </w:rPr>
+            </m:ctrlPr>
+          </m:sSubPr>
+          <m:e>
+            <m:r>
+              <m:rPr>
+                <m:sty m:val="p"/>
+              </m:rPr>
+              <w:rPr>
+                <w:rFonts w:hint="eastAsia" w:ascii="DejaVu Math TeX Gyre" w:hAnsi="DejaVu Math TeX Gyre" w:eastAsia="楷体" w:cs="Times New Roman"/>
+                <w:sz w:val="28"/>
+                <w:szCs w:val="28"/>
+                <w:highlight w:val="none"/>
+                <w:lang w:eastAsia="zh-CN"/>
+              </w:rPr>
+              <m:t>H</m:t>
+            </m:r>
+            <m:ctrlPr>
+              <w:rPr>
+                <w:rFonts w:hint="eastAsia" w:ascii="DejaVu Math TeX Gyre" w:hAnsi="DejaVu Math TeX Gyre" w:eastAsia="楷体" w:cs="Times New Roman"/>
+                <w:i w:val="0"/>
+                <w:sz w:val="28"/>
+                <w:szCs w:val="28"/>
+                <w:highlight w:val="none"/>
+                <w:lang w:eastAsia="zh-CN"/>
+              </w:rPr>
+            </m:ctrlPr>
+          </m:e>
+          <m:sub>
+            <m:r>
+              <m:rPr>
+                <m:sty m:val="p"/>
+              </m:rPr>
+              <w:rPr>
+                <w:rFonts w:hint="eastAsia" w:ascii="DejaVu Math TeX Gyre" w:hAnsi="DejaVu Math TeX Gyre" w:eastAsia="楷体" w:cs="Times New Roman"/>
+                <w:sz w:val="28"/>
+                <w:szCs w:val="28"/>
+                <w:highlight w:val="none"/>
+                <w:lang w:eastAsia="zh-CN"/>
+              </w:rPr>
+              <m:t>0</m:t>
+            </m:r>
+            <m:ctrlPr>
+              <w:rPr>
+                <w:rFonts w:hint="eastAsia" w:ascii="DejaVu Math TeX Gyre" w:hAnsi="DejaVu Math TeX Gyre" w:eastAsia="楷体" w:cs="Times New Roman"/>
+                <w:i w:val="0"/>
+                <w:sz w:val="28"/>
+                <w:szCs w:val="28"/>
+                <w:highlight w:val="none"/>
+                <w:lang w:eastAsia="zh-CN"/>
+              </w:rPr>
+            </m:ctrlPr>
+          </m:sub>
+        </m:sSub>
+      </m:oMath>
+      <w:r>
+        <w:rPr>
+          <w:rFonts w:hint="eastAsia" w:ascii="Times New Roman" w:hAnsi="Times New Roman" w:eastAsia="楷体" w:cs="Times New Roman"/>
+          <w:sz w:val="28"/>
+          <w:szCs w:val="28"/>
+        </w:rPr>
+        <w:t>是否小于或等于15%，若是，将q+1赋值给q，返回步骤S32；若否，则判定跨中区段浇筑完成，并进入步骤S4。</w:t>
       </w:r>
     </w:p>
     <w:p>
@@ -1029,229 +1251,7 @@
           <w:sz w:val="28"/>
           <w:szCs w:val="28"/>
         </w:rPr>
-        <w:t>S33、判断(</w:t>
-      </w:r>
-      <m:oMath>
-        <m:sSub>
-          <m:sSubPr>
-            <m:ctrlPr>
-              <w:rPr>
-                <w:rFonts w:hint="eastAsia" w:ascii="DejaVu Math TeX Gyre" w:hAnsi="DejaVu Math TeX Gyre" w:eastAsia="楷体" w:cs="Times New Roman"/>
-                <w:i w:val="0"/>
-                <w:sz w:val="28"/>
-                <w:szCs w:val="28"/>
-                <w:highlight w:val="none"/>
-                <w:lang w:eastAsia="zh-CN"/>
-              </w:rPr>
-            </m:ctrlPr>
-          </m:sSubPr>
-          <m:e>
-            <m:r>
-              <m:rPr>
-                <m:sty m:val="p"/>
-              </m:rPr>
-              <w:rPr>
-                <w:rFonts w:hint="eastAsia" w:ascii="DejaVu Math TeX Gyre" w:hAnsi="DejaVu Math TeX Gyre" w:eastAsia="楷体" w:cs="Times New Roman"/>
-                <w:sz w:val="28"/>
-                <w:szCs w:val="28"/>
-                <w:highlight w:val="none"/>
-                <w:lang w:eastAsia="zh-CN"/>
-              </w:rPr>
-              <m:t>H</m:t>
-            </m:r>
-            <m:ctrlPr>
-              <w:rPr>
-                <w:rFonts w:hint="eastAsia" w:ascii="DejaVu Math TeX Gyre" w:hAnsi="DejaVu Math TeX Gyre" w:eastAsia="楷体" w:cs="Times New Roman"/>
-                <w:i w:val="0"/>
-                <w:sz w:val="28"/>
-                <w:szCs w:val="28"/>
-                <w:highlight w:val="none"/>
-                <w:lang w:eastAsia="zh-CN"/>
-              </w:rPr>
-            </m:ctrlPr>
-          </m:e>
-          <m:sub>
-            <m:r>
-              <m:rPr>
-                <m:sty m:val="p"/>
-              </m:rPr>
-              <w:rPr>
-                <w:rFonts w:hint="default" w:ascii="DejaVu Math TeX Gyre" w:hAnsi="DejaVu Math TeX Gyre" w:eastAsia="楷体" w:cs="Times New Roman"/>
-                <w:sz w:val="28"/>
-                <w:szCs w:val="28"/>
-                <w:highlight w:val="none"/>
-                <w:lang w:val="en-US" w:eastAsia="zh-CN"/>
-              </w:rPr>
-              <m:t>1</m:t>
-            </m:r>
-            <m:ctrlPr>
-              <w:rPr>
-                <w:rFonts w:hint="eastAsia" w:ascii="DejaVu Math TeX Gyre" w:hAnsi="DejaVu Math TeX Gyre" w:eastAsia="楷体" w:cs="Times New Roman"/>
-                <w:i w:val="0"/>
-                <w:sz w:val="28"/>
-                <w:szCs w:val="28"/>
-                <w:highlight w:val="none"/>
-                <w:lang w:eastAsia="zh-CN"/>
-              </w:rPr>
-            </m:ctrlPr>
-          </m:sub>
-        </m:sSub>
-      </m:oMath>
-      <w:r>
-        <w:rPr>
-          <w:rFonts w:hint="eastAsia" w:ascii="Times New Roman" w:hAnsi="Times New Roman" w:eastAsia="楷体" w:cs="Times New Roman"/>
-          <w:sz w:val="28"/>
-          <w:szCs w:val="28"/>
-        </w:rPr>
-        <w:t>−</w:t>
-      </w:r>
-      <m:oMath>
-        <m:sSub>
-          <m:sSubPr>
-            <m:ctrlPr>
-              <w:rPr>
-                <w:rFonts w:hint="eastAsia" w:ascii="DejaVu Math TeX Gyre" w:hAnsi="DejaVu Math TeX Gyre" w:eastAsia="楷体" w:cs="Times New Roman"/>
-                <w:i w:val="0"/>
-                <w:sz w:val="28"/>
-                <w:szCs w:val="28"/>
-                <w:highlight w:val="none"/>
-                <w:lang w:eastAsia="zh-CN"/>
-              </w:rPr>
-            </m:ctrlPr>
-          </m:sSubPr>
-          <m:e>
-            <m:r>
-              <m:rPr>
-                <m:sty m:val="p"/>
-              </m:rPr>
-              <w:rPr>
-                <w:rFonts w:hint="eastAsia" w:ascii="DejaVu Math TeX Gyre" w:hAnsi="DejaVu Math TeX Gyre" w:eastAsia="楷体" w:cs="Times New Roman"/>
-                <w:sz w:val="28"/>
-                <w:szCs w:val="28"/>
-                <w:highlight w:val="none"/>
-                <w:lang w:eastAsia="zh-CN"/>
-              </w:rPr>
-              <m:t>H</m:t>
-            </m:r>
-            <m:ctrlPr>
-              <w:rPr>
-                <w:rFonts w:hint="eastAsia" w:ascii="DejaVu Math TeX Gyre" w:hAnsi="DejaVu Math TeX Gyre" w:eastAsia="楷体" w:cs="Times New Roman"/>
-                <w:i w:val="0"/>
-                <w:sz w:val="28"/>
-                <w:szCs w:val="28"/>
-                <w:highlight w:val="none"/>
-                <w:lang w:eastAsia="zh-CN"/>
-              </w:rPr>
-            </m:ctrlPr>
-          </m:e>
-          <m:sub>
-            <m:r>
-              <m:rPr>
-                <m:sty m:val="p"/>
-              </m:rPr>
-              <w:rPr>
-                <w:rFonts w:hint="eastAsia" w:ascii="DejaVu Math TeX Gyre" w:hAnsi="DejaVu Math TeX Gyre" w:eastAsia="楷体" w:cs="Times New Roman"/>
-                <w:sz w:val="28"/>
-                <w:szCs w:val="28"/>
-                <w:highlight w:val="none"/>
-                <w:lang w:eastAsia="zh-CN"/>
-              </w:rPr>
-              <m:t>0</m:t>
-            </m:r>
-            <m:ctrlPr>
-              <w:rPr>
-                <w:rFonts w:hint="eastAsia" w:ascii="DejaVu Math TeX Gyre" w:hAnsi="DejaVu Math TeX Gyre" w:eastAsia="楷体" w:cs="Times New Roman"/>
-                <w:i w:val="0"/>
-                <w:sz w:val="28"/>
-                <w:szCs w:val="28"/>
-                <w:highlight w:val="none"/>
-                <w:lang w:eastAsia="zh-CN"/>
-              </w:rPr>
-            </m:ctrlPr>
-          </m:sub>
-        </m:sSub>
-      </m:oMath>
-      <w:r>
-        <w:rPr>
-          <w:rFonts w:hint="eastAsia" w:ascii="Times New Roman" w:hAnsi="Times New Roman" w:eastAsia="楷体" w:cs="Times New Roman"/>
-          <w:sz w:val="28"/>
-          <w:szCs w:val="28"/>
-        </w:rPr>
-        <w:t>)/</w:t>
-      </w:r>
-      <m:oMath>
-        <m:sSub>
-          <m:sSubPr>
-            <m:ctrlPr>
-              <w:rPr>
-                <w:rFonts w:hint="eastAsia" w:ascii="DejaVu Math TeX Gyre" w:hAnsi="DejaVu Math TeX Gyre" w:eastAsia="楷体" w:cs="Times New Roman"/>
-                <w:i w:val="0"/>
-                <w:sz w:val="28"/>
-                <w:szCs w:val="28"/>
-                <w:highlight w:val="none"/>
-                <w:lang w:eastAsia="zh-CN"/>
-              </w:rPr>
-            </m:ctrlPr>
-          </m:sSubPr>
-          <m:e>
-            <m:r>
-              <m:rPr>
-                <m:sty m:val="p"/>
-              </m:rPr>
-              <w:rPr>
-                <w:rFonts w:hint="eastAsia" w:ascii="DejaVu Math TeX Gyre" w:hAnsi="DejaVu Math TeX Gyre" w:eastAsia="楷体" w:cs="Times New Roman"/>
-                <w:sz w:val="28"/>
-                <w:szCs w:val="28"/>
-                <w:highlight w:val="none"/>
-                <w:lang w:eastAsia="zh-CN"/>
-              </w:rPr>
-              <m:t>H</m:t>
-            </m:r>
-            <m:ctrlPr>
-              <w:rPr>
-                <w:rFonts w:hint="eastAsia" w:ascii="DejaVu Math TeX Gyre" w:hAnsi="DejaVu Math TeX Gyre" w:eastAsia="楷体" w:cs="Times New Roman"/>
-                <w:i w:val="0"/>
-                <w:sz w:val="28"/>
-                <w:szCs w:val="28"/>
-                <w:highlight w:val="none"/>
-                <w:lang w:eastAsia="zh-CN"/>
-              </w:rPr>
-            </m:ctrlPr>
-          </m:e>
-          <m:sub>
-            <m:r>
-              <m:rPr>
-                <m:sty m:val="p"/>
-              </m:rPr>
-              <w:rPr>
-                <w:rFonts w:hint="eastAsia" w:ascii="DejaVu Math TeX Gyre" w:hAnsi="DejaVu Math TeX Gyre" w:eastAsia="楷体" w:cs="Times New Roman"/>
-                <w:sz w:val="28"/>
-                <w:szCs w:val="28"/>
-                <w:highlight w:val="none"/>
-                <w:lang w:eastAsia="zh-CN"/>
-              </w:rPr>
-              <m:t>0</m:t>
-            </m:r>
-            <m:ctrlPr>
-              <w:rPr>
-                <w:rFonts w:hint="eastAsia" w:ascii="DejaVu Math TeX Gyre" w:hAnsi="DejaVu Math TeX Gyre" w:eastAsia="楷体" w:cs="Times New Roman"/>
-                <w:i w:val="0"/>
-                <w:sz w:val="28"/>
-                <w:szCs w:val="28"/>
-                <w:highlight w:val="none"/>
-                <w:lang w:eastAsia="zh-CN"/>
-              </w:rPr>
-            </m:ctrlPr>
-          </m:sub>
-        </m:sSub>
-      </m:oMath>
-      <w:r>
-        <w:rPr>
-          <w:rFonts w:hint="eastAsia" w:ascii="Times New Roman" w:hAnsi="Times New Roman" w:eastAsia="楷体" w:cs="Times New Roman"/>
-          <w:sz w:val="28"/>
-          <w:szCs w:val="28"/>
-        </w:rPr>
-        <w:t>是否小于或等于15%，若是，将q+1赋值给q，返回步骤S32；若否，则判定跨中区段浇筑完成，并进入步骤S4。</w:t>
+        <w:t>3.根据权利要求2所述的悬索桥钢混组合梁原位叠合浇筑施工方法，其特征在于，所述S4中由跨中向两侧索塔对第i浇筑批次的所述非吊索区湿接缝进行逐批次、对称且跳仓浇筑包括以下步骤：</w:t>
       </w:r>
     </w:p>
     <w:p>
@@ -1273,7 +1273,7 @@
           <w:sz w:val="28"/>
           <w:szCs w:val="28"/>
         </w:rPr>
-        <w:t>3.根据权利要求2所述的悬索桥钢混组合梁原位叠合浇筑施工方法，其特征在于，所述S4中由跨中向两侧索塔对第i浇筑批次的所述非吊索区湿接缝进行逐批次、对称且跳仓浇筑包括以下步骤：</w:t>
+        <w:t>S34、第i浇筑批次开始前，获取主缆跨中相对湿接缝浇筑前标高的当前竖向位移δ，向下为正；</w:t>
       </w:r>
     </w:p>
     <w:p>
@@ -1295,29 +1295,7 @@
           <w:sz w:val="28"/>
           <w:szCs w:val="28"/>
         </w:rPr>
-        <w:t>S34、第i浇筑批次开始前，获取主缆跨中相对湿接缝浇筑前标高的当前竖向位移δ，向下为正；</w:t>
-      </w:r>
-    </w:p>
-    <w:p>
-      <w:pPr>
-        <w:pStyle w:val="4"/>
-        <w:widowControl w:val="0"/>
-        <w:spacing w:line="500" w:lineRule="exact"/>
-        <w:ind w:firstLine="560" w:firstLineChars="200"/>
-        <w:jc w:val="both"/>
-        <w:rPr>
-          <w:rFonts w:hint="eastAsia" w:eastAsia="楷体" w:cs="Times New Roman"/>
-          <w:sz w:val="28"/>
-          <w:szCs w:val="28"/>
-        </w:rPr>
-      </w:pPr>
-      <w:r>
-        <w:rPr>
-          <w:rFonts w:hint="eastAsia" w:ascii="Times New Roman" w:hAnsi="Times New Roman" w:eastAsia="楷体" w:cs="Times New Roman"/>
-          <w:sz w:val="28"/>
-          <w:szCs w:val="28"/>
-        </w:rPr>
-        <w:t>S35、获得各节段单位浇筑荷载对跨中竖向位移的影响系数</w:t>
+        <w:t>S35、获得各节段单位浇筑方量对跨中竖向位移的影响系数</w:t>
       </w:r>
       <m:oMath>
         <m:sSub>
@@ -1517,7 +1495,7 @@
           <w:sz w:val="28"/>
           <w:szCs w:val="28"/>
         </w:rPr>
-        <w:t>与δ同向为正，针对尚未浇筑的各对称节段对j，按</w:t>
+        <w:t>为浇筑1 m³湿接缝混凝土引起的跨中竖向位移响应，与δ同向为正，针对尚未浇筑的各对称节段对j，按</w:t>
       </w:r>
       <m:oMath>
         <m:sSub>
@@ -2195,7 +2173,7 @@
           <w:sz w:val="28"/>
           <w:szCs w:val="28"/>
         </w:rPr>
-        <w:t>4.根据权利要求1所述的悬索桥钢混组合梁原位叠合浇筑施工方法，其特征在于，所述S6中，在所述第一阶段的湿接缝混凝土达到预设强度、且主缆线形达到预设指标后进入步骤S7；所述预设指标为：所述第一阶段连续三个浇筑批次中，每一批次结束后的跨中竖向位移变化量Δv均满足|Δv|≤3mm，且每一批次结束后的索塔塔顶纵向位移变化量均≤5mm。</w:t>
+        <w:t>4.根据权利要求1所述的悬索桥钢混组合梁原位叠合浇筑施工方法，其特征在于，所述S6中，在所述第一阶段的湿接缝混凝土达到预设强度、且主缆线形达到预设指标后开始所述第二阶段浇筑；所述预设指标为：所述第一阶段连续三个浇筑批次中，每一批次结束后的跨中竖向位移变化量Δv均满足|Δv|≤3mm，且每一批次结束后的索塔塔顶纵向位移变化量均≤5mm。</w:t>
       </w:r>
     </w:p>
     <w:p>
@@ -2217,7 +2195,7 @@
           <w:sz w:val="28"/>
           <w:szCs w:val="28"/>
         </w:rPr>
-        <w:t>5.根据权利要求1所述的悬索桥钢混组合梁原位叠合浇筑施工方法，其特征在于，所述S7中，在第N浇筑批次为所述第二阶段最末一批次之前，先执行以下步骤：</w:t>
+        <w:t>5.根据权利要求1所述的悬索桥钢混组合梁原位叠合浇筑施工方法，其特征在于，所述S6中，在第N浇筑批次为所述第二阶段最末一批次之前，先执行以下步骤：</w:t>
       </w:r>
     </w:p>
     <w:p>
@@ -4094,7 +4072,7 @@
           <w:sz w:val="28"/>
           <w:szCs w:val="28"/>
         </w:rPr>
-        <w:t>S6、判断所述第一阶段的湿接缝混凝土是否达到预设强度，若否，待所述湿接缝混凝土达到预设强度后进入步骤S7；若是，进入步骤S7；</w:t>
+        <w:t>S6、判断所述第一阶段的湿接缝混凝土是否达到预设强度，若否，待所述湿接缝混凝土达到预设强度后开始第二阶段浇筑；若是，开始第二阶段浇筑；所述第二阶段由跨中向两侧索塔对称浇筑第N浇筑批次的所述吊索区湿接缝；其中，N≥1，N为正整数，N的起始值为1；</w:t>
       </w:r>
     </w:p>
     <w:p>
@@ -4116,7 +4094,7 @@
           <w:sz w:val="28"/>
           <w:szCs w:val="28"/>
         </w:rPr>
-        <w:t>S7、开始第二阶段浇筑，由跨中向两侧索塔对称浇筑第N浇筑批次的所述吊索区湿接缝；其中，N≥1，N为正整数，N的起始值为1；</w:t>
+        <w:t>S7、判断第N浇筑批次完成后是否仍存在尚未浇筑的吊索区湿接缝，若是，将N+1赋值给N，返回步骤S6中所述第二阶段浇筑；若否，全桥湿接缝浇筑完成并形成组合截面。</w:t>
       </w:r>
     </w:p>
     <w:p>
@@ -4138,7 +4116,7 @@
           <w:sz w:val="28"/>
           <w:szCs w:val="28"/>
         </w:rPr>
-        <w:t>S8、判断第N浇筑批次完成后是否仍存在尚未浇筑的吊索区湿接缝，若是，将N+1赋值给N，返回步骤S7；若否，全桥湿接缝浇筑完成并形成组合截面。</w:t>
+        <w:t>进一步地，所述S3中预设跨中区段按以下步骤确定并浇筑：</w:t>
       </w:r>
     </w:p>
     <w:p>
@@ -4160,7 +4138,81 @@
           <w:sz w:val="28"/>
           <w:szCs w:val="28"/>
         </w:rPr>
-        <w:t>进一步地，所述S3中预设跨中区段按以下步骤确定并浇筑：</w:t>
+        <w:t>S31、以主缆跨中为起点，在浇筑前获得初始主缆水平张力</w:t>
+      </w:r>
+      <m:oMath>
+        <m:sSub>
+          <m:sSubPr>
+            <m:ctrlPr>
+              <w:rPr>
+                <w:rFonts w:hint="eastAsia" w:ascii="DejaVu Math TeX Gyre" w:hAnsi="DejaVu Math TeX Gyre" w:eastAsia="楷体" w:cs="Times New Roman"/>
+                <w:i w:val="0"/>
+                <w:sz w:val="28"/>
+                <w:szCs w:val="28"/>
+                <w:highlight w:val="none"/>
+                <w:lang w:eastAsia="zh-CN"/>
+              </w:rPr>
+            </m:ctrlPr>
+          </m:sSubPr>
+          <m:e>
+            <m:r>
+              <m:rPr>
+                <m:sty m:val="p"/>
+              </m:rPr>
+              <w:rPr>
+                <w:rFonts w:hint="eastAsia" w:ascii="DejaVu Math TeX Gyre" w:hAnsi="DejaVu Math TeX Gyre" w:eastAsia="楷体" w:cs="Times New Roman"/>
+                <w:sz w:val="28"/>
+                <w:szCs w:val="28"/>
+                <w:highlight w:val="none"/>
+                <w:lang w:eastAsia="zh-CN"/>
+              </w:rPr>
+              <m:t>H</m:t>
+            </m:r>
+            <m:ctrlPr>
+              <w:rPr>
+                <w:rFonts w:hint="eastAsia" w:ascii="DejaVu Math TeX Gyre" w:hAnsi="DejaVu Math TeX Gyre" w:eastAsia="楷体" w:cs="Times New Roman"/>
+                <w:i w:val="0"/>
+                <w:sz w:val="28"/>
+                <w:szCs w:val="28"/>
+                <w:highlight w:val="none"/>
+                <w:lang w:eastAsia="zh-CN"/>
+              </w:rPr>
+            </m:ctrlPr>
+          </m:e>
+          <m:sub>
+            <m:r>
+              <m:rPr>
+                <m:sty m:val="p"/>
+              </m:rPr>
+              <w:rPr>
+                <w:rFonts w:hint="eastAsia" w:ascii="DejaVu Math TeX Gyre" w:hAnsi="DejaVu Math TeX Gyre" w:eastAsia="楷体" w:cs="Times New Roman"/>
+                <w:sz w:val="28"/>
+                <w:szCs w:val="28"/>
+                <w:highlight w:val="none"/>
+                <w:lang w:eastAsia="zh-CN"/>
+              </w:rPr>
+              <m:t>0</m:t>
+            </m:r>
+            <m:ctrlPr>
+              <w:rPr>
+                <w:rFonts w:hint="eastAsia" w:ascii="DejaVu Math TeX Gyre" w:hAnsi="DejaVu Math TeX Gyre" w:eastAsia="楷体" w:cs="Times New Roman"/>
+                <w:i w:val="0"/>
+                <w:sz w:val="28"/>
+                <w:szCs w:val="28"/>
+                <w:highlight w:val="none"/>
+                <w:lang w:eastAsia="zh-CN"/>
+              </w:rPr>
+            </m:ctrlPr>
+          </m:sub>
+        </m:sSub>
+      </m:oMath>
+      <w:r>
+        <w:rPr>
+          <w:rFonts w:hint="eastAsia" w:ascii="Times New Roman" w:hAnsi="Times New Roman" w:eastAsia="楷体" w:cs="Times New Roman"/>
+          <w:sz w:val="28"/>
+          <w:szCs w:val="28"/>
+        </w:rPr>
+        <w:t>，并令q≥1，q为正整数，q的起始值为1；</w:t>
       </w:r>
     </w:p>
     <w:p>
@@ -4182,7 +4234,7 @@
           <w:sz w:val="28"/>
           <w:szCs w:val="28"/>
         </w:rPr>
-        <w:t>S31、以主缆跨中为起点，在浇筑前获得初始主缆水平张力</w:t>
+        <w:t>S32、向两侧索塔方向对称选取第q次尚未浇筑的非吊索区湿接缝并浇筑，获得浇筑后的当前主缆水平张力</w:t>
       </w:r>
       <m:oMath>
         <m:sSub>
@@ -4229,13 +4281,13 @@
                 <m:sty m:val="p"/>
               </m:rPr>
               <w:rPr>
-                <w:rFonts w:hint="eastAsia" w:ascii="DejaVu Math TeX Gyre" w:hAnsi="DejaVu Math TeX Gyre" w:eastAsia="楷体" w:cs="Times New Roman"/>
-                <w:sz w:val="28"/>
-                <w:szCs w:val="28"/>
-                <w:highlight w:val="none"/>
-                <w:lang w:eastAsia="zh-CN"/>
-              </w:rPr>
-              <m:t>0</m:t>
+                <w:rFonts w:hint="default" w:ascii="DejaVu Math TeX Gyre" w:hAnsi="DejaVu Math TeX Gyre" w:eastAsia="楷体" w:cs="Times New Roman"/>
+                <w:sz w:val="28"/>
+                <w:szCs w:val="28"/>
+                <w:highlight w:val="none"/>
+                <w:lang w:val="en-US" w:eastAsia="zh-CN"/>
+              </w:rPr>
+              <m:t>1</m:t>
             </m:r>
             <m:ctrlPr>
               <w:rPr>
@@ -4256,7 +4308,7 @@
           <w:sz w:val="28"/>
           <w:szCs w:val="28"/>
         </w:rPr>
-        <w:t>，并令q≥1，q为正整数，q的起始值为1；</w:t>
+        <w:t>；</w:t>
       </w:r>
     </w:p>
     <w:p>
@@ -4278,7 +4330,7 @@
           <w:sz w:val="28"/>
           <w:szCs w:val="28"/>
         </w:rPr>
-        <w:t>S32、向两侧索塔方向对称选取第q次尚未浇筑的非吊索区湿接缝并浇筑，获得浇筑后的当前主缆水平张力</w:t>
+        <w:t>S33、判断(</w:t>
       </w:r>
       <m:oMath>
         <m:sSub>
@@ -4352,7 +4404,155 @@
           <w:sz w:val="28"/>
           <w:szCs w:val="28"/>
         </w:rPr>
-        <w:t>；</w:t>
+        <w:t>−</w:t>
+      </w:r>
+      <m:oMath>
+        <m:sSub>
+          <m:sSubPr>
+            <m:ctrlPr>
+              <w:rPr>
+                <w:rFonts w:hint="eastAsia" w:ascii="DejaVu Math TeX Gyre" w:hAnsi="DejaVu Math TeX Gyre" w:eastAsia="楷体" w:cs="Times New Roman"/>
+                <w:i w:val="0"/>
+                <w:sz w:val="28"/>
+                <w:szCs w:val="28"/>
+                <w:highlight w:val="none"/>
+                <w:lang w:eastAsia="zh-CN"/>
+              </w:rPr>
+            </m:ctrlPr>
+          </m:sSubPr>
+          <m:e>
+            <m:r>
+              <m:rPr>
+                <m:sty m:val="p"/>
+              </m:rPr>
+              <w:rPr>
+                <w:rFonts w:hint="eastAsia" w:ascii="DejaVu Math TeX Gyre" w:hAnsi="DejaVu Math TeX Gyre" w:eastAsia="楷体" w:cs="Times New Roman"/>
+                <w:sz w:val="28"/>
+                <w:szCs w:val="28"/>
+                <w:highlight w:val="none"/>
+                <w:lang w:eastAsia="zh-CN"/>
+              </w:rPr>
+              <m:t>H</m:t>
+            </m:r>
+            <m:ctrlPr>
+              <w:rPr>
+                <w:rFonts w:hint="eastAsia" w:ascii="DejaVu Math TeX Gyre" w:hAnsi="DejaVu Math TeX Gyre" w:eastAsia="楷体" w:cs="Times New Roman"/>
+                <w:i w:val="0"/>
+                <w:sz w:val="28"/>
+                <w:szCs w:val="28"/>
+                <w:highlight w:val="none"/>
+                <w:lang w:eastAsia="zh-CN"/>
+              </w:rPr>
+            </m:ctrlPr>
+          </m:e>
+          <m:sub>
+            <m:r>
+              <m:rPr>
+                <m:sty m:val="p"/>
+              </m:rPr>
+              <w:rPr>
+                <w:rFonts w:hint="eastAsia" w:ascii="DejaVu Math TeX Gyre" w:hAnsi="DejaVu Math TeX Gyre" w:eastAsia="楷体" w:cs="Times New Roman"/>
+                <w:sz w:val="28"/>
+                <w:szCs w:val="28"/>
+                <w:highlight w:val="none"/>
+                <w:lang w:eastAsia="zh-CN"/>
+              </w:rPr>
+              <m:t>0</m:t>
+            </m:r>
+            <m:ctrlPr>
+              <w:rPr>
+                <w:rFonts w:hint="eastAsia" w:ascii="DejaVu Math TeX Gyre" w:hAnsi="DejaVu Math TeX Gyre" w:eastAsia="楷体" w:cs="Times New Roman"/>
+                <w:i w:val="0"/>
+                <w:sz w:val="28"/>
+                <w:szCs w:val="28"/>
+                <w:highlight w:val="none"/>
+                <w:lang w:eastAsia="zh-CN"/>
+              </w:rPr>
+            </m:ctrlPr>
+          </m:sub>
+        </m:sSub>
+      </m:oMath>
+      <w:r>
+        <w:rPr>
+          <w:rFonts w:hint="eastAsia" w:ascii="Times New Roman" w:hAnsi="Times New Roman" w:eastAsia="楷体" w:cs="Times New Roman"/>
+          <w:sz w:val="28"/>
+          <w:szCs w:val="28"/>
+        </w:rPr>
+        <w:t>)/</w:t>
+      </w:r>
+      <m:oMath>
+        <m:sSub>
+          <m:sSubPr>
+            <m:ctrlPr>
+              <w:rPr>
+                <w:rFonts w:hint="eastAsia" w:ascii="DejaVu Math TeX Gyre" w:hAnsi="DejaVu Math TeX Gyre" w:eastAsia="楷体" w:cs="Times New Roman"/>
+                <w:i w:val="0"/>
+                <w:sz w:val="28"/>
+                <w:szCs w:val="28"/>
+                <w:highlight w:val="none"/>
+                <w:lang w:eastAsia="zh-CN"/>
+              </w:rPr>
+            </m:ctrlPr>
+          </m:sSubPr>
+          <m:e>
+            <m:r>
+              <m:rPr>
+                <m:sty m:val="p"/>
+              </m:rPr>
+              <w:rPr>
+                <w:rFonts w:hint="eastAsia" w:ascii="DejaVu Math TeX Gyre" w:hAnsi="DejaVu Math TeX Gyre" w:eastAsia="楷体" w:cs="Times New Roman"/>
+                <w:sz w:val="28"/>
+                <w:szCs w:val="28"/>
+                <w:highlight w:val="none"/>
+                <w:lang w:eastAsia="zh-CN"/>
+              </w:rPr>
+              <m:t>H</m:t>
+            </m:r>
+            <m:ctrlPr>
+              <w:rPr>
+                <w:rFonts w:hint="eastAsia" w:ascii="DejaVu Math TeX Gyre" w:hAnsi="DejaVu Math TeX Gyre" w:eastAsia="楷体" w:cs="Times New Roman"/>
+                <w:i w:val="0"/>
+                <w:sz w:val="28"/>
+                <w:szCs w:val="28"/>
+                <w:highlight w:val="none"/>
+                <w:lang w:eastAsia="zh-CN"/>
+              </w:rPr>
+            </m:ctrlPr>
+          </m:e>
+          <m:sub>
+            <m:r>
+              <m:rPr>
+                <m:sty m:val="p"/>
+              </m:rPr>
+              <w:rPr>
+                <w:rFonts w:hint="eastAsia" w:ascii="DejaVu Math TeX Gyre" w:hAnsi="DejaVu Math TeX Gyre" w:eastAsia="楷体" w:cs="Times New Roman"/>
+                <w:sz w:val="28"/>
+                <w:szCs w:val="28"/>
+                <w:highlight w:val="none"/>
+                <w:lang w:eastAsia="zh-CN"/>
+              </w:rPr>
+              <m:t>0</m:t>
+            </m:r>
+            <m:ctrlPr>
+              <w:rPr>
+                <w:rFonts w:hint="eastAsia" w:ascii="DejaVu Math TeX Gyre" w:hAnsi="DejaVu Math TeX Gyre" w:eastAsia="楷体" w:cs="Times New Roman"/>
+                <w:i w:val="0"/>
+                <w:sz w:val="28"/>
+                <w:szCs w:val="28"/>
+                <w:highlight w:val="none"/>
+                <w:lang w:eastAsia="zh-CN"/>
+              </w:rPr>
+            </m:ctrlPr>
+          </m:sub>
+        </m:sSub>
+      </m:oMath>
+      <w:r>
+        <w:rPr>
+          <w:rFonts w:hint="eastAsia" w:ascii="Times New Roman" w:hAnsi="Times New Roman" w:eastAsia="楷体" w:cs="Times New Roman"/>
+          <w:sz w:val="28"/>
+          <w:szCs w:val="28"/>
+        </w:rPr>
+        <w:t>是否小于或等于15%，若是，将q+1赋值给q，返回步骤S32；若否，则判定跨中区段浇筑完成，并进入步骤S4。</w:t>
       </w:r>
     </w:p>
     <w:p>
@@ -4374,229 +4574,7 @@
           <w:sz w:val="28"/>
           <w:szCs w:val="28"/>
         </w:rPr>
-        <w:t>S33、判断(</w:t>
-      </w:r>
-      <m:oMath>
-        <m:sSub>
-          <m:sSubPr>
-            <m:ctrlPr>
-              <w:rPr>
-                <w:rFonts w:hint="eastAsia" w:ascii="DejaVu Math TeX Gyre" w:hAnsi="DejaVu Math TeX Gyre" w:eastAsia="楷体" w:cs="Times New Roman"/>
-                <w:i w:val="0"/>
-                <w:sz w:val="28"/>
-                <w:szCs w:val="28"/>
-                <w:highlight w:val="none"/>
-                <w:lang w:eastAsia="zh-CN"/>
-              </w:rPr>
-            </m:ctrlPr>
-          </m:sSubPr>
-          <m:e>
-            <m:r>
-              <m:rPr>
-                <m:sty m:val="p"/>
-              </m:rPr>
-              <w:rPr>
-                <w:rFonts w:hint="eastAsia" w:ascii="DejaVu Math TeX Gyre" w:hAnsi="DejaVu Math TeX Gyre" w:eastAsia="楷体" w:cs="Times New Roman"/>
-                <w:sz w:val="28"/>
-                <w:szCs w:val="28"/>
-                <w:highlight w:val="none"/>
-                <w:lang w:eastAsia="zh-CN"/>
-              </w:rPr>
-              <m:t>H</m:t>
-            </m:r>
-            <m:ctrlPr>
-              <w:rPr>
-                <w:rFonts w:hint="eastAsia" w:ascii="DejaVu Math TeX Gyre" w:hAnsi="DejaVu Math TeX Gyre" w:eastAsia="楷体" w:cs="Times New Roman"/>
-                <w:i w:val="0"/>
-                <w:sz w:val="28"/>
-                <w:szCs w:val="28"/>
-                <w:highlight w:val="none"/>
-                <w:lang w:eastAsia="zh-CN"/>
-              </w:rPr>
-            </m:ctrlPr>
-          </m:e>
-          <m:sub>
-            <m:r>
-              <m:rPr>
-                <m:sty m:val="p"/>
-              </m:rPr>
-              <w:rPr>
-                <w:rFonts w:hint="default" w:ascii="DejaVu Math TeX Gyre" w:hAnsi="DejaVu Math TeX Gyre" w:eastAsia="楷体" w:cs="Times New Roman"/>
-                <w:sz w:val="28"/>
-                <w:szCs w:val="28"/>
-                <w:highlight w:val="none"/>
-                <w:lang w:val="en-US" w:eastAsia="zh-CN"/>
-              </w:rPr>
-              <m:t>1</m:t>
-            </m:r>
-            <m:ctrlPr>
-              <w:rPr>
-                <w:rFonts w:hint="eastAsia" w:ascii="DejaVu Math TeX Gyre" w:hAnsi="DejaVu Math TeX Gyre" w:eastAsia="楷体" w:cs="Times New Roman"/>
-                <w:i w:val="0"/>
-                <w:sz w:val="28"/>
-                <w:szCs w:val="28"/>
-                <w:highlight w:val="none"/>
-                <w:lang w:eastAsia="zh-CN"/>
-              </w:rPr>
-            </m:ctrlPr>
-          </m:sub>
-        </m:sSub>
-      </m:oMath>
-      <w:r>
-        <w:rPr>
-          <w:rFonts w:hint="eastAsia" w:ascii="Times New Roman" w:hAnsi="Times New Roman" w:eastAsia="楷体" w:cs="Times New Roman"/>
-          <w:sz w:val="28"/>
-          <w:szCs w:val="28"/>
-        </w:rPr>
-        <w:t>−</w:t>
-      </w:r>
-      <m:oMath>
-        <m:sSub>
-          <m:sSubPr>
-            <m:ctrlPr>
-              <w:rPr>
-                <w:rFonts w:hint="eastAsia" w:ascii="DejaVu Math TeX Gyre" w:hAnsi="DejaVu Math TeX Gyre" w:eastAsia="楷体" w:cs="Times New Roman"/>
-                <w:i w:val="0"/>
-                <w:sz w:val="28"/>
-                <w:szCs w:val="28"/>
-                <w:highlight w:val="none"/>
-                <w:lang w:eastAsia="zh-CN"/>
-              </w:rPr>
-            </m:ctrlPr>
-          </m:sSubPr>
-          <m:e>
-            <m:r>
-              <m:rPr>
-                <m:sty m:val="p"/>
-              </m:rPr>
-              <w:rPr>
-                <w:rFonts w:hint="eastAsia" w:ascii="DejaVu Math TeX Gyre" w:hAnsi="DejaVu Math TeX Gyre" w:eastAsia="楷体" w:cs="Times New Roman"/>
-                <w:sz w:val="28"/>
-                <w:szCs w:val="28"/>
-                <w:highlight w:val="none"/>
-                <w:lang w:eastAsia="zh-CN"/>
-              </w:rPr>
-              <m:t>H</m:t>
-            </m:r>
-            <m:ctrlPr>
-              <w:rPr>
-                <w:rFonts w:hint="eastAsia" w:ascii="DejaVu Math TeX Gyre" w:hAnsi="DejaVu Math TeX Gyre" w:eastAsia="楷体" w:cs="Times New Roman"/>
-                <w:i w:val="0"/>
-                <w:sz w:val="28"/>
-                <w:szCs w:val="28"/>
-                <w:highlight w:val="none"/>
-                <w:lang w:eastAsia="zh-CN"/>
-              </w:rPr>
-            </m:ctrlPr>
-          </m:e>
-          <m:sub>
-            <m:r>
-              <m:rPr>
-                <m:sty m:val="p"/>
-              </m:rPr>
-              <w:rPr>
-                <w:rFonts w:hint="eastAsia" w:ascii="DejaVu Math TeX Gyre" w:hAnsi="DejaVu Math TeX Gyre" w:eastAsia="楷体" w:cs="Times New Roman"/>
-                <w:sz w:val="28"/>
-                <w:szCs w:val="28"/>
-                <w:highlight w:val="none"/>
-                <w:lang w:eastAsia="zh-CN"/>
-              </w:rPr>
-              <m:t>0</m:t>
-            </m:r>
-            <m:ctrlPr>
-              <w:rPr>
-                <w:rFonts w:hint="eastAsia" w:ascii="DejaVu Math TeX Gyre" w:hAnsi="DejaVu Math TeX Gyre" w:eastAsia="楷体" w:cs="Times New Roman"/>
-                <w:i w:val="0"/>
-                <w:sz w:val="28"/>
-                <w:szCs w:val="28"/>
-                <w:highlight w:val="none"/>
-                <w:lang w:eastAsia="zh-CN"/>
-              </w:rPr>
-            </m:ctrlPr>
-          </m:sub>
-        </m:sSub>
-      </m:oMath>
-      <w:r>
-        <w:rPr>
-          <w:rFonts w:hint="eastAsia" w:ascii="Times New Roman" w:hAnsi="Times New Roman" w:eastAsia="楷体" w:cs="Times New Roman"/>
-          <w:sz w:val="28"/>
-          <w:szCs w:val="28"/>
-        </w:rPr>
-        <w:t>)/</w:t>
-      </w:r>
-      <m:oMath>
-        <m:sSub>
-          <m:sSubPr>
-            <m:ctrlPr>
-              <w:rPr>
-                <w:rFonts w:hint="eastAsia" w:ascii="DejaVu Math TeX Gyre" w:hAnsi="DejaVu Math TeX Gyre" w:eastAsia="楷体" w:cs="Times New Roman"/>
-                <w:i w:val="0"/>
-                <w:sz w:val="28"/>
-                <w:szCs w:val="28"/>
-                <w:highlight w:val="none"/>
-                <w:lang w:eastAsia="zh-CN"/>
-              </w:rPr>
-            </m:ctrlPr>
-          </m:sSubPr>
-          <m:e>
-            <m:r>
-              <m:rPr>
-                <m:sty m:val="p"/>
-              </m:rPr>
-              <w:rPr>
-                <w:rFonts w:hint="eastAsia" w:ascii="DejaVu Math TeX Gyre" w:hAnsi="DejaVu Math TeX Gyre" w:eastAsia="楷体" w:cs="Times New Roman"/>
-                <w:sz w:val="28"/>
-                <w:szCs w:val="28"/>
-                <w:highlight w:val="none"/>
-                <w:lang w:eastAsia="zh-CN"/>
-              </w:rPr>
-              <m:t>H</m:t>
-            </m:r>
-            <m:ctrlPr>
-              <w:rPr>
-                <w:rFonts w:hint="eastAsia" w:ascii="DejaVu Math TeX Gyre" w:hAnsi="DejaVu Math TeX Gyre" w:eastAsia="楷体" w:cs="Times New Roman"/>
-                <w:i w:val="0"/>
-                <w:sz w:val="28"/>
-                <w:szCs w:val="28"/>
-                <w:highlight w:val="none"/>
-                <w:lang w:eastAsia="zh-CN"/>
-              </w:rPr>
-            </m:ctrlPr>
-          </m:e>
-          <m:sub>
-            <m:r>
-              <m:rPr>
-                <m:sty m:val="p"/>
-              </m:rPr>
-              <w:rPr>
-                <w:rFonts w:hint="eastAsia" w:ascii="DejaVu Math TeX Gyre" w:hAnsi="DejaVu Math TeX Gyre" w:eastAsia="楷体" w:cs="Times New Roman"/>
-                <w:sz w:val="28"/>
-                <w:szCs w:val="28"/>
-                <w:highlight w:val="none"/>
-                <w:lang w:eastAsia="zh-CN"/>
-              </w:rPr>
-              <m:t>0</m:t>
-            </m:r>
-            <m:ctrlPr>
-              <w:rPr>
-                <w:rFonts w:hint="eastAsia" w:ascii="DejaVu Math TeX Gyre" w:hAnsi="DejaVu Math TeX Gyre" w:eastAsia="楷体" w:cs="Times New Roman"/>
-                <w:i w:val="0"/>
-                <w:sz w:val="28"/>
-                <w:szCs w:val="28"/>
-                <w:highlight w:val="none"/>
-                <w:lang w:eastAsia="zh-CN"/>
-              </w:rPr>
-            </m:ctrlPr>
-          </m:sub>
-        </m:sSub>
-      </m:oMath>
-      <w:r>
-        <w:rPr>
-          <w:rFonts w:hint="eastAsia" w:ascii="Times New Roman" w:hAnsi="Times New Roman" w:eastAsia="楷体" w:cs="Times New Roman"/>
-          <w:sz w:val="28"/>
-          <w:szCs w:val="28"/>
-        </w:rPr>
-        <w:t>是否小于或等于15%，若是，将q+1赋值给q，返回步骤S32；若否，则判定跨中区段浇筑完成，并进入步骤S4。</w:t>
+        <w:t>进一步地，所述S4中由跨中向两侧索塔对第i浇筑批次的非吊索区湿接缝进行逐批次、对称且跳仓浇筑时，按照以下步骤进行：</w:t>
       </w:r>
     </w:p>
     <w:p>
@@ -4618,7 +4596,7 @@
           <w:sz w:val="28"/>
           <w:szCs w:val="28"/>
         </w:rPr>
-        <w:t>进一步地，所述S4中由跨中向两侧索塔对第i浇筑批次的非吊索区湿接缝进行逐批次、对称且跳仓浇筑时，按照以下步骤进行：</w:t>
+        <w:t>S34、第i浇筑批次开始前，获取主缆跨中相对湿接缝浇筑前标高的当前竖向位移δ，向下为正；</w:t>
       </w:r>
     </w:p>
     <w:p>
@@ -4640,29 +4618,7 @@
           <w:sz w:val="28"/>
           <w:szCs w:val="28"/>
         </w:rPr>
-        <w:t>S34、第i浇筑批次开始前，获取主缆跨中相对湿接缝浇筑前标高的当前竖向位移δ，向下为正；</w:t>
-      </w:r>
-    </w:p>
-    <w:p>
-      <w:pPr>
-        <w:pStyle w:val="4"/>
-        <w:widowControl w:val="0"/>
-        <w:spacing w:line="500" w:lineRule="exact"/>
-        <w:ind w:firstLine="560" w:firstLineChars="200"/>
-        <w:jc w:val="both"/>
-        <w:rPr>
-          <w:rFonts w:hint="eastAsia" w:eastAsia="楷体" w:cs="Times New Roman"/>
-          <w:sz w:val="28"/>
-          <w:szCs w:val="28"/>
-        </w:rPr>
-      </w:pPr>
-      <w:r>
-        <w:rPr>
-          <w:rFonts w:hint="eastAsia" w:ascii="Times New Roman" w:hAnsi="Times New Roman" w:eastAsia="楷体" w:cs="Times New Roman"/>
-          <w:sz w:val="28"/>
-          <w:szCs w:val="28"/>
-        </w:rPr>
-        <w:t>S35、获得各节段单位浇筑荷载对跨中竖向位移的影响系数</w:t>
+        <w:t>S35、获得各节段单位浇筑方量对跨中竖向位移的影响系数</w:t>
       </w:r>
       <m:oMath>
         <m:sSub>
@@ -4862,7 +4818,7 @@
           <w:sz w:val="28"/>
           <w:szCs w:val="28"/>
         </w:rPr>
-        <w:t>与δ同向为正，针对尚未浇筑的各对称节段对j，按</w:t>
+        <w:t>为浇筑1 m³湿接缝混凝土引起的跨中竖向位移响应，与δ同向为正，针对尚未浇筑的各对称节段对j，按</w:t>
       </w:r>
       <m:oMath>
         <m:sSub>
@@ -5584,7 +5540,7 @@
           <w:sz w:val="28"/>
           <w:szCs w:val="28"/>
         </w:rPr>
-        <w:t>进一步地，所述S6中，所述第二阶段在主缆线形达到预设指标后进入步骤S7；所述预设指标为：所述第一阶段连续三个浇筑批次中，每一批次结束后的跨中竖向位移变化量Δv均满足|Δv|≤3mm，且每一批次结束后的索塔塔顶纵向位移变化量均≤5mm。</w:t>
+        <w:t>进一步地，所述S6中，在所述第一阶段的湿接缝混凝土达到预设强度、且主缆线形达到预设指标后开始所述第二阶段浇筑；所述预设指标为：所述第一阶段连续三个浇筑批次中，每一批次结束后的跨中竖向位移变化量Δv均满足|Δv|≤3mm，且每一批次结束后的索塔塔顶纵向位移变化量均≤5mm。</w:t>
       </w:r>
     </w:p>
     <w:p>
@@ -5606,7 +5562,7 @@
           <w:sz w:val="28"/>
           <w:szCs w:val="28"/>
         </w:rPr>
-        <w:t>进一步地，所述S7中，在第N浇筑批次为所述第二阶段最末一批次之前，复测主缆跨中、1/4跨和3/4跨的标高，得到各测点的实测标高，并计算各测点实测标高与该测点当前施工阶段目标标高之差Δ</w:t>
+        <w:t>进一步地，所述S6中，在第N浇筑批次为所述第二阶段最末一批次之前，复测主缆跨中、1/4跨和3/4跨的标高，得到各测点的实测标高，并计算各测点实测标高与该测点当前施工阶段目标标高之差Δ</w:t>
       </w:r>
       <m:oMath>
         <m:sSub>
@@ -7362,7 +7318,7 @@
           <w:sz w:val="28"/>
           <w:szCs w:val="28"/>
         </w:rPr>
-        <w:t>S6、判断所述第一阶段的湿接缝混凝土是否达到预设强度，若否，待所述湿接缝混凝土达到预设强度后进入步骤S7；若是，进入步骤S7；</w:t>
+        <w:t>S6、判断所述第一阶段的湿接缝混凝土是否达到预设强度，若否，待所述湿接缝混凝土达到预设强度后开始第二阶段浇筑；若是，开始第二阶段浇筑；所述第二阶段由跨中向两侧索塔对称浇筑第N浇筑批次的所述吊索区湿接缝；其中，N≥1，N为正整数，N的起始值为1；</w:t>
       </w:r>
     </w:p>
     <w:p>
@@ -7384,29 +7340,7 @@
           <w:sz w:val="28"/>
           <w:szCs w:val="28"/>
         </w:rPr>
-        <w:t>S7、开始第二阶段浇筑，由跨中向两侧索塔对称浇筑第N浇筑批次的所述吊索区湿接缝；其中，N≥1，N为正整数，N的起始值为1；</w:t>
-      </w:r>
-    </w:p>
-    <w:p>
-      <w:pPr>
-        <w:pStyle w:val="4"/>
-        <w:widowControl w:val="0"/>
-        <w:spacing w:line="500" w:lineRule="exact"/>
-        <w:ind w:firstLine="560" w:firstLineChars="200"/>
-        <w:jc w:val="both"/>
-        <w:rPr>
-          <w:rFonts w:hint="eastAsia" w:eastAsia="楷体" w:cs="Times New Roman"/>
-          <w:sz w:val="28"/>
-          <w:szCs w:val="28"/>
-        </w:rPr>
-      </w:pPr>
-      <w:r>
-        <w:rPr>
-          <w:rFonts w:hint="eastAsia" w:ascii="Times New Roman" w:hAnsi="Times New Roman" w:eastAsia="楷体" w:cs="Times New Roman"/>
-          <w:sz w:val="28"/>
-          <w:szCs w:val="28"/>
-        </w:rPr>
-        <w:t>S8、判断第N浇筑批次完成后是否仍存在尚未浇筑的吊索区湿接缝，若是，将N+1赋值给N，返回步骤S7；若否，全桥湿接缝浇筑完成并形成组合截面。</w:t>
+        <w:t>S7、判断第N浇筑批次完成后是否仍存在尚未浇筑的吊索区湿接缝，若是，将N+1赋值给N，返回步骤S6中所述第二阶段浇筑；若否，全桥湿接缝浇筑完成并形成组合截面。</w:t>
       </w:r>
     </w:p>
     <w:p>
@@ -8681,7 +8615,7 @@
           <w:sz w:val="28"/>
           <w:szCs w:val="28"/>
         </w:rPr>
-        <w:t>S35、获得各节段单位浇筑荷载对跨中竖向位移的影响系数</w:t>
+        <w:t>S35、获得各节段单位浇筑方量对跨中竖向位移的影响系数</w:t>
       </w:r>
       <m:oMath>
         <m:sSub>
@@ -8881,7 +8815,7 @@
           <w:sz w:val="28"/>
           <w:szCs w:val="28"/>
         </w:rPr>
-        <w:t>与δ同向为正，针对尚未浇筑的各对称节段对j，按</w:t>
+        <w:t>为浇筑1 m³湿接缝混凝土引起的跨中竖向位移响应，与δ同向为正，针对尚未浇筑的各对称节段对j，按</w:t>
       </w:r>
       <m:oMath>
         <m:sSub>
@@ -9567,7 +9501,7 @@
           <w:highlight w:val="none"/>
           <w:lang w:val="en-US" w:eastAsia="zh-CN"/>
         </w:rPr>
-        <w:t>本实施例中，所述当前竖向位移δ是指每一浇筑批次开始前，主缆跨中标高相对湿接缝浇筑开始前同一测点标高的竖向改变量，向下为正、向上为负，用于表征跨中相对浇筑起点已累积的下沉或抬升。所述对称节段对j是指相对主缆跨中左右对称、拟在同一批次同步浇筑的一对非吊索区湿接缝节段。所述影响系数</w:t>
+        <w:t>本实施例中，所述当前竖向位移δ是指每一浇筑批次开始前，主缆跨中标高相对湿接缝浇筑开始前同一测点标高的竖向改变量，向下为正、向上为负，用于表征跨中相对浇筑起点已累积的下沉或抬升。所述对称节段对j是指相对主缆跨中左右对称、拟在同一批次同步浇筑的一对非吊索区湿接缝节段。所述影响系数是指节段对j中第m个节段浇筑1 m³湿接缝混凝土时引起的跨中竖向位移响应；其符号与δ同向约定为正，即该节段加载使跨中继续下沉时为正，使跨中抬升时为负。所述预估跨中竖向位移是指假定本批次浇筑该对称节段对后，在现有δ基础上叠加各节段计划方量与相应影响系数之积后得到的跨中竖向位移预估值。</w:t>
       </w:r>
       <m:oMath>
         <m:sSub>
@@ -9669,7 +9603,6 @@
           <w:highlight w:val="none"/>
           <w:lang w:val="en-US" w:eastAsia="zh-CN"/>
         </w:rPr>
-        <w:t>是指节段对j中第m个节段在单位浇筑荷载作用下引起的跨中竖向位移响应；其符号与δ同向约定为正，即该节段加载使跨中继续下沉时</w:t>
       </w:r>
       <m:oMath>
         <m:sSub>
@@ -9771,7 +9704,6 @@
           <w:highlight w:val="none"/>
           <w:lang w:val="en-US" w:eastAsia="zh-CN"/>
         </w:rPr>
-        <w:t>为正，使跨中抬升时</w:t>
       </w:r>
       <m:oMath>
         <m:sSub>
@@ -9873,7 +9805,6 @@
           <w:highlight w:val="none"/>
           <w:lang w:val="en-US" w:eastAsia="zh-CN"/>
         </w:rPr>
-        <w:t>为负。所述预估跨中竖向位移</w:t>
       </w:r>
       <m:oMath>
         <m:sSub>
@@ -9949,7 +9880,6 @@
           <w:highlight w:val="none"/>
           <w:lang w:val="en-US" w:eastAsia="zh-CN"/>
         </w:rPr>
-        <w:t>是指假定本批次浇筑该对称节段对后，在现有δ基础上叠加各节段计划方量与相应影响系数之积后得到的跨中竖向位移预估值。</w:t>
       </w:r>
     </w:p>
     <w:p>
@@ -9979,7 +9909,7 @@
           <w:highlight w:val="none"/>
           <w:lang w:val="en-US" w:eastAsia="zh-CN"/>
         </w:rPr>
-        <w:t>影响系数</w:t>
+        <w:t>影响系数的获得，可依据当前施工阶段的主缆—吊索—加劲梁计算模型，对相应节段施加1 m³湿接缝混凝土对应的等效自重，读取跨中竖向位移响应得到；亦可由主缆变形影响线在该节段位置的取值换算得到。同一批次比选中，各对称节段对应采用同一计算模型与同一符号约定，以保证可比。</w:t>
       </w:r>
       <m:oMath>
         <m:sSub>
@@ -10081,7 +10011,6 @@
           <w:highlight w:val="none"/>
           <w:lang w:val="en-US" w:eastAsia="zh-CN"/>
         </w:rPr>
-        <w:t>的获得，可依据当前施工阶段的主缆—吊索—加劲梁计算模型，对相应节段施加单位浇筑荷载或等效单位湿接缝自重，读取跨中竖向位移响应得到；亦可由主缆变形影响线在该节段位置的取值换算得到。同一批次比选中，各对称节段对应采用同一计算模型与同一符号约定，以保证</w:t>
       </w:r>
       <m:oMath>
         <m:sSub>
@@ -10157,7 +10086,6 @@
           <w:highlight w:val="none"/>
           <w:lang w:val="en-US" w:eastAsia="zh-CN"/>
         </w:rPr>
-        <w:t>可比。</w:t>
       </w:r>
     </w:p>
     <w:p>

</xml_diff>

<commit_message>
Clarify claim 2 midspan expansion as the q-th pour of the next unset joints.
Replace the ambiguous “第q次尚未浇筑” wording with selecting one remaining
symmetric group, nearest midspan first, as the q-th pouring object.

Co-authored-by: 2427613265-ai <2427613265-ai@users.noreply.github.com>
</commit_message>
<xml_diff>
--- a/docs/PA26-1238-I-A_权利要求书优化稿.docx
+++ b/docs/PA26-1238-I-A_权利要求书优化稿.docx
@@ -889,7 +889,7 @@
           <w:sz w:val="28"/>
           <w:szCs w:val="28"/>
         </w:rPr>
-        <w:t>，并令q≥1，q为正整数，q的起始值为1；</w:t>
+        <w:t>，作为跨中区段扩展的张力基准；令q≥1，q为正整数，q的起始值为1；</w:t>
       </w:r>
     </w:p>
     <w:p>
@@ -911,7 +911,7 @@
           <w:sz w:val="28"/>
           <w:szCs w:val="28"/>
         </w:rPr>
-        <w:t>S32、向两侧索塔方向对称选取第q次尚未浇筑的非吊索区湿接缝并浇筑，获得浇筑后的当前主缆水平张力</w:t>
+        <w:t>S32、由跨中向两侧索塔方向，按距跨中由近及远的顺序，对称选取一组尚未浇筑的非吊索区湿接缝作为第q次浇筑对象并浇筑，获得浇筑后的当前主缆水平张力</w:t>
       </w:r>
       <m:oMath>
         <m:sSub>
@@ -1229,7 +1229,7 @@
           <w:sz w:val="28"/>
           <w:szCs w:val="28"/>
         </w:rPr>
-        <w:t>是否小于或等于15%，若是，将q+1赋值给q，返回步骤S32；若否，则判定跨中区段浇筑完成，并进入步骤S4。</w:t>
+        <w:t>是否小于或等于15%，若是，将q+1赋值给q，返回步骤S32，继续按距跨中由近及远的顺序对称浇筑下一组尚未浇筑的非吊索区湿接缝；若否，则判定预设跨中区段浇筑完成，并进入步骤S4。</w:t>
       </w:r>
     </w:p>
     <w:p>
@@ -4212,7 +4212,7 @@
           <w:sz w:val="28"/>
           <w:szCs w:val="28"/>
         </w:rPr>
-        <w:t>，并令q≥1，q为正整数，q的起始值为1；</w:t>
+        <w:t>，作为跨中区段扩展的张力基准；令q≥1，q为正整数，q的起始值为1；</w:t>
       </w:r>
     </w:p>
     <w:p>
@@ -4234,7 +4234,7 @@
           <w:sz w:val="28"/>
           <w:szCs w:val="28"/>
         </w:rPr>
-        <w:t>S32、向两侧索塔方向对称选取第q次尚未浇筑的非吊索区湿接缝并浇筑，获得浇筑后的当前主缆水平张力</w:t>
+        <w:t>S32、由跨中向两侧索塔方向，按距跨中由近及远的顺序，对称选取一组尚未浇筑的非吊索区湿接缝作为第q次浇筑对象并浇筑，获得浇筑后的当前主缆水平张力</w:t>
       </w:r>
       <m:oMath>
         <m:sSub>
@@ -4552,7 +4552,7 @@
           <w:sz w:val="28"/>
           <w:szCs w:val="28"/>
         </w:rPr>
-        <w:t>是否小于或等于15%，若是，将q+1赋值给q，返回步骤S32；若否，则判定跨中区段浇筑完成，并进入步骤S4。</w:t>
+        <w:t>是否小于或等于15%，若是，将q+1赋值给q，返回步骤S32，继续按距跨中由近及远的顺序对称浇筑下一组尚未浇筑的非吊索区湿接缝；若否，则判定预设跨中区段浇筑完成，并进入步骤S4。</w:t>
       </w:r>
     </w:p>
     <w:p>
@@ -8000,7 +8000,7 @@
           <w:sz w:val="28"/>
           <w:szCs w:val="28"/>
         </w:rPr>
-        <w:t>，并令q≥1，q为正整数，q的起始值为1；</w:t>
+        <w:t>，作为跨中区段扩展的张力基准；令q≥1，q为正整数，q的起始值为1；</w:t>
       </w:r>
     </w:p>
     <w:p>
@@ -8022,7 +8022,7 @@
           <w:sz w:val="28"/>
           <w:szCs w:val="28"/>
         </w:rPr>
-        <w:t>S32、向两侧索塔方向对称选取第q次尚未浇筑的非吊索区湿接缝并浇筑，获得浇筑后的当前主缆水平张力</w:t>
+        <w:t>S32、由跨中向两侧索塔方向，按距跨中由近及远的顺序，对称选取一组尚未浇筑的非吊索区湿接缝作为第q次浇筑对象并浇筑，获得浇筑后的当前主缆水平张力</w:t>
       </w:r>
       <m:oMath>
         <m:sSub>
@@ -8340,7 +8340,7 @@
           <w:sz w:val="28"/>
           <w:szCs w:val="28"/>
         </w:rPr>
-        <w:t>是否小于或等于15%，若是，将q+1赋值给q，返回步骤S32；若否，则判定跨中区段浇筑完成，并进入步骤S4。</w:t>
+        <w:t>是否小于或等于15%，若是，将q+1赋值给q，返回步骤S32，继续按距跨中由近及远的顺序对称浇筑下一组尚未浇筑的非吊索区湿接缝；若否，则判定预设跨中区段浇筑完成，并进入步骤S4。</w:t>
       </w:r>
     </w:p>
     <w:p>
@@ -8430,7 +8430,7 @@
           <w:highlight w:val="none"/>
           <w:lang w:val="en-US" w:eastAsia="zh-CN"/>
         </w:rPr>
-        <w:t>具体而言，如前所述，第一阶段需先完成预设跨中区段的非吊索区湿接缝浇筑。本实施例以主缆跨中为起点，向两侧索塔方向对称选取尚未浇筑的非吊索区湿接缝。在步骤S31于浇筑前一次获得H₀，作为本轮跨中扩展的张力基准；此后按第q次选取并浇筑，浇筑完成后获得H₁，并计算(H₁−H₀)/H₀。若(H₁−H₀)/H₀≤15%，将q+1赋值给q并返回步骤S32，H₀保持不变；若(H₁−H₀)/H₀&gt;15%，判定跨中区段浇筑完成，进入步骤S4。</w:t>
+        <w:t>具体而言，如前所述，第一阶段需先完成预设跨中区段的非吊索区湿接缝浇筑。本实施例以主缆跨中为起点，向两侧索塔方向对称选取尚未浇筑的非吊索区湿接缝。在步骤S31于浇筑前一次获得H₀，作为本轮跨中扩展的张力基准；此后由跨中向两侧、按距跨中由近及远的顺序，将一组尚未浇筑的非吊索区湿接缝作为第q次浇筑对象并浇筑，浇筑完成后获得H₁，并计算(H₁−H₀)/H₀。若(H₁−H₀)/H₀≤15%，将q+1赋值给q并返回步骤S32，H₀保持不变，继续浇筑下一组；若(H₁−H₀)/H₀&gt;15%，判定跨中区段浇筑完成，进入步骤S4。</w:t>
       </w:r>
     </w:p>
     <w:p>

</xml_diff>

<commit_message>
Move claim 1 definitions into a new dependent claim.
Shorten the independent claim to the two-stage numbered loops, and put
hanger-zone, midspan-section, and skip-pour definitions in claim 2.

Co-authored-by: 2427613265-ai <2427613265-ai@users.noreply.github.com>
</commit_message>
<xml_diff>
--- a/docs/PA26-1238-I-A_权利要求书优化稿.docx
+++ b/docs/PA26-1238-I-A_权利要求书优化稿.docx
@@ -647,7 +647,7 @@
           <w:sz w:val="28"/>
           <w:szCs w:val="28"/>
         </w:rPr>
-        <w:t>S2、将所述湿接缝划分为吊索区湿接缝和非吊索区湿接缝；所述吊索区湿接缝为位于吊索的中心线两侧预设范围内的湿接缝；所述非吊索区湿接缝为除所述吊索区湿接缝以外的湿接缝；</w:t>
+        <w:t>S2、将所述湿接缝划分为吊索区湿接缝和非吊索区湿接缝；</w:t>
       </w:r>
     </w:p>
     <w:p>
@@ -669,7 +669,7 @@
           <w:sz w:val="28"/>
           <w:szCs w:val="28"/>
         </w:rPr>
-        <w:t>S3、开始第一阶段浇筑，先浇筑预设跨中区段的所述非吊索区湿接缝；其中，所述跨中区段为以跨中为中心对称延伸的区段；</w:t>
+        <w:t>S3、开始第一阶段浇筑，先浇筑预设跨中区段的所述非吊索区湿接缝；</w:t>
       </w:r>
     </w:p>
     <w:p>
@@ -691,7 +691,7 @@
           <w:sz w:val="28"/>
           <w:szCs w:val="28"/>
         </w:rPr>
-        <w:t>S4、再由跨中向两侧索塔对第i浇筑批次的所述非吊索区湿接缝进行逐批次、对称且跳仓浇筑；其中，i≥1，i为正整数，i的起始值为1；所述跳仓浇筑为沿纵桥向间隔至少一个吊索节段浇筑，所述吊索节段为相邻两吊索之间区段；</w:t>
+        <w:t>S4、再由跨中向两侧索塔对第i浇筑批次的所述非吊索区湿接缝进行逐批次、对称且跳仓浇筑；其中，i为正整数，i的起始值为1；</w:t>
       </w:r>
     </w:p>
     <w:p>
@@ -735,7 +735,7 @@
           <w:sz w:val="28"/>
           <w:szCs w:val="28"/>
         </w:rPr>
-        <w:t>S6、判断所述第一阶段的湿接缝混凝土是否达到预设强度，若否，待所述湿接缝混凝土达到预设强度后开始第二阶段浇筑；若是，开始第二阶段浇筑；所述第二阶段由跨中向两侧索塔对称浇筑第N浇筑批次的所述吊索区湿接缝；其中，N≥1，N为正整数，N的起始值为1；</w:t>
+        <w:t>S6、待所述第一阶段的湿接缝混凝土达到预设强度后，开始第二阶段浇筑，由跨中向两侧索塔对称浇筑第N浇筑批次的所述吊索区湿接缝；其中，N为正整数，N的起始值为1；</w:t>
       </w:r>
     </w:p>
     <w:p>
@@ -793,7 +793,7 @@
           <w:sz w:val="28"/>
           <w:szCs w:val="28"/>
         </w:rPr>
-        <w:t>2.根据权利要求1所述的悬索桥钢混组合梁原位叠合浇筑施工方法，其特征在于，所述S3中先浇筑预设跨中区段的所述非吊索区湿接缝包括以下步骤：</w:t>
+        <w:t>2.根据权利要求1所述的悬索桥钢混组合梁原位叠合浇筑施工方法，其特征在于，所述吊索区湿接缝为位于吊索的中心线两侧预设范围内的湿接缝；所述非吊索区湿接缝为除所述吊索区湿接缝以外的湿接缝；所述跨中区段为以跨中为中心对称延伸的区段；所述跳仓浇筑为沿纵桥向间隔至少一个吊索节段浇筑，所述吊索节段为相邻两吊索之间区段。</w:t>
       </w:r>
     </w:p>
     <w:p>
@@ -815,81 +815,7 @@
           <w:sz w:val="28"/>
           <w:szCs w:val="28"/>
         </w:rPr>
-        <w:t>S31、以主缆跨中为起点，在浇筑前获得初始主缆水平张力</w:t>
-      </w:r>
-      <m:oMath>
-        <m:sSub>
-          <m:sSubPr>
-            <m:ctrlPr>
-              <w:rPr>
-                <w:rFonts w:hint="eastAsia" w:ascii="DejaVu Math TeX Gyre" w:hAnsi="DejaVu Math TeX Gyre" w:eastAsia="楷体" w:cs="Times New Roman"/>
-                <w:i w:val="0"/>
-                <w:sz w:val="28"/>
-                <w:szCs w:val="28"/>
-                <w:highlight w:val="none"/>
-                <w:lang w:eastAsia="zh-CN"/>
-              </w:rPr>
-            </m:ctrlPr>
-          </m:sSubPr>
-          <m:e>
-            <m:r>
-              <m:rPr>
-                <m:sty m:val="p"/>
-              </m:rPr>
-              <w:rPr>
-                <w:rFonts w:hint="eastAsia" w:ascii="DejaVu Math TeX Gyre" w:hAnsi="DejaVu Math TeX Gyre" w:eastAsia="楷体" w:cs="Times New Roman"/>
-                <w:sz w:val="28"/>
-                <w:szCs w:val="28"/>
-                <w:highlight w:val="none"/>
-                <w:lang w:eastAsia="zh-CN"/>
-              </w:rPr>
-              <m:t>H</m:t>
-            </m:r>
-            <m:ctrlPr>
-              <w:rPr>
-                <w:rFonts w:hint="eastAsia" w:ascii="DejaVu Math TeX Gyre" w:hAnsi="DejaVu Math TeX Gyre" w:eastAsia="楷体" w:cs="Times New Roman"/>
-                <w:i w:val="0"/>
-                <w:sz w:val="28"/>
-                <w:szCs w:val="28"/>
-                <w:highlight w:val="none"/>
-                <w:lang w:eastAsia="zh-CN"/>
-              </w:rPr>
-            </m:ctrlPr>
-          </m:e>
-          <m:sub>
-            <m:r>
-              <m:rPr>
-                <m:sty m:val="p"/>
-              </m:rPr>
-              <w:rPr>
-                <w:rFonts w:hint="eastAsia" w:ascii="DejaVu Math TeX Gyre" w:hAnsi="DejaVu Math TeX Gyre" w:eastAsia="楷体" w:cs="Times New Roman"/>
-                <w:sz w:val="28"/>
-                <w:szCs w:val="28"/>
-                <w:highlight w:val="none"/>
-                <w:lang w:eastAsia="zh-CN"/>
-              </w:rPr>
-              <m:t>0</m:t>
-            </m:r>
-            <m:ctrlPr>
-              <w:rPr>
-                <w:rFonts w:hint="eastAsia" w:ascii="DejaVu Math TeX Gyre" w:hAnsi="DejaVu Math TeX Gyre" w:eastAsia="楷体" w:cs="Times New Roman"/>
-                <w:i w:val="0"/>
-                <w:sz w:val="28"/>
-                <w:szCs w:val="28"/>
-                <w:highlight w:val="none"/>
-                <w:lang w:eastAsia="zh-CN"/>
-              </w:rPr>
-            </m:ctrlPr>
-          </m:sub>
-        </m:sSub>
-      </m:oMath>
-      <w:r>
-        <w:rPr>
-          <w:rFonts w:hint="eastAsia" w:ascii="Times New Roman" w:hAnsi="Times New Roman" w:eastAsia="楷体" w:cs="Times New Roman"/>
-          <w:sz w:val="28"/>
-          <w:szCs w:val="28"/>
-        </w:rPr>
-        <w:t>，作为跨中区段扩展的张力基准；令q≥1，q为正整数，q的起始值为1；</w:t>
+        <w:t>3.根据权利要求1所述的悬索桥钢混组合梁原位叠合浇筑施工方法，其特征在于，所述S3中先浇筑预设跨中区段的所述非吊索区湿接缝包括以下步骤：</w:t>
       </w:r>
     </w:p>
     <w:p>
@@ -911,7 +837,7 @@
           <w:sz w:val="28"/>
           <w:szCs w:val="28"/>
         </w:rPr>
-        <w:t>S32、由跨中向两侧索塔方向，按距跨中由近及远的顺序，对称选取一组尚未浇筑的非吊索区湿接缝作为第q次浇筑对象并浇筑，获得浇筑后的当前主缆水平张力</w:t>
+        <w:t>S31、以主缆跨中为起点，在浇筑前获得初始主缆水平张力</w:t>
       </w:r>
       <m:oMath>
         <m:sSub>
@@ -958,13 +884,13 @@
                 <m:sty m:val="p"/>
               </m:rPr>
               <w:rPr>
-                <w:rFonts w:hint="default" w:ascii="DejaVu Math TeX Gyre" w:hAnsi="DejaVu Math TeX Gyre" w:eastAsia="楷体" w:cs="Times New Roman"/>
-                <w:sz w:val="28"/>
-                <w:szCs w:val="28"/>
-                <w:highlight w:val="none"/>
-                <w:lang w:val="en-US" w:eastAsia="zh-CN"/>
-              </w:rPr>
-              <m:t>1</m:t>
+                <w:rFonts w:hint="eastAsia" w:ascii="DejaVu Math TeX Gyre" w:hAnsi="DejaVu Math TeX Gyre" w:eastAsia="楷体" w:cs="Times New Roman"/>
+                <w:sz w:val="28"/>
+                <w:szCs w:val="28"/>
+                <w:highlight w:val="none"/>
+                <w:lang w:eastAsia="zh-CN"/>
+              </w:rPr>
+              <m:t>0</m:t>
             </m:r>
             <m:ctrlPr>
               <w:rPr>
@@ -985,7 +911,7 @@
           <w:sz w:val="28"/>
           <w:szCs w:val="28"/>
         </w:rPr>
-        <w:t>；</w:t>
+        <w:t>，作为跨中区段扩展的张力基准；令q≥1，q为正整数，q的起始值为1；</w:t>
       </w:r>
     </w:p>
     <w:p>
@@ -1007,7 +933,7 @@
           <w:sz w:val="28"/>
           <w:szCs w:val="28"/>
         </w:rPr>
-        <w:t>S33、判断(</w:t>
+        <w:t>S32、由跨中向两侧索塔方向，按距跨中由近及远的顺序，对称选取一组尚未浇筑的非吊索区湿接缝作为第q次浇筑对象并浇筑，获得浇筑后的当前主缆水平张力</w:t>
       </w:r>
       <m:oMath>
         <m:sSub>
@@ -1081,155 +1007,7 @@
           <w:sz w:val="28"/>
           <w:szCs w:val="28"/>
         </w:rPr>
-        <w:t>−</w:t>
-      </w:r>
-      <m:oMath>
-        <m:sSub>
-          <m:sSubPr>
-            <m:ctrlPr>
-              <w:rPr>
-                <w:rFonts w:hint="eastAsia" w:ascii="DejaVu Math TeX Gyre" w:hAnsi="DejaVu Math TeX Gyre" w:eastAsia="楷体" w:cs="Times New Roman"/>
-                <w:i w:val="0"/>
-                <w:sz w:val="28"/>
-                <w:szCs w:val="28"/>
-                <w:highlight w:val="none"/>
-                <w:lang w:eastAsia="zh-CN"/>
-              </w:rPr>
-            </m:ctrlPr>
-          </m:sSubPr>
-          <m:e>
-            <m:r>
-              <m:rPr>
-                <m:sty m:val="p"/>
-              </m:rPr>
-              <w:rPr>
-                <w:rFonts w:hint="eastAsia" w:ascii="DejaVu Math TeX Gyre" w:hAnsi="DejaVu Math TeX Gyre" w:eastAsia="楷体" w:cs="Times New Roman"/>
-                <w:sz w:val="28"/>
-                <w:szCs w:val="28"/>
-                <w:highlight w:val="none"/>
-                <w:lang w:eastAsia="zh-CN"/>
-              </w:rPr>
-              <m:t>H</m:t>
-            </m:r>
-            <m:ctrlPr>
-              <w:rPr>
-                <w:rFonts w:hint="eastAsia" w:ascii="DejaVu Math TeX Gyre" w:hAnsi="DejaVu Math TeX Gyre" w:eastAsia="楷体" w:cs="Times New Roman"/>
-                <w:i w:val="0"/>
-                <w:sz w:val="28"/>
-                <w:szCs w:val="28"/>
-                <w:highlight w:val="none"/>
-                <w:lang w:eastAsia="zh-CN"/>
-              </w:rPr>
-            </m:ctrlPr>
-          </m:e>
-          <m:sub>
-            <m:r>
-              <m:rPr>
-                <m:sty m:val="p"/>
-              </m:rPr>
-              <w:rPr>
-                <w:rFonts w:hint="eastAsia" w:ascii="DejaVu Math TeX Gyre" w:hAnsi="DejaVu Math TeX Gyre" w:eastAsia="楷体" w:cs="Times New Roman"/>
-                <w:sz w:val="28"/>
-                <w:szCs w:val="28"/>
-                <w:highlight w:val="none"/>
-                <w:lang w:eastAsia="zh-CN"/>
-              </w:rPr>
-              <m:t>0</m:t>
-            </m:r>
-            <m:ctrlPr>
-              <w:rPr>
-                <w:rFonts w:hint="eastAsia" w:ascii="DejaVu Math TeX Gyre" w:hAnsi="DejaVu Math TeX Gyre" w:eastAsia="楷体" w:cs="Times New Roman"/>
-                <w:i w:val="0"/>
-                <w:sz w:val="28"/>
-                <w:szCs w:val="28"/>
-                <w:highlight w:val="none"/>
-                <w:lang w:eastAsia="zh-CN"/>
-              </w:rPr>
-            </m:ctrlPr>
-          </m:sub>
-        </m:sSub>
-      </m:oMath>
-      <w:r>
-        <w:rPr>
-          <w:rFonts w:hint="eastAsia" w:ascii="Times New Roman" w:hAnsi="Times New Roman" w:eastAsia="楷体" w:cs="Times New Roman"/>
-          <w:sz w:val="28"/>
-          <w:szCs w:val="28"/>
-        </w:rPr>
-        <w:t>)/</w:t>
-      </w:r>
-      <m:oMath>
-        <m:sSub>
-          <m:sSubPr>
-            <m:ctrlPr>
-              <w:rPr>
-                <w:rFonts w:hint="eastAsia" w:ascii="DejaVu Math TeX Gyre" w:hAnsi="DejaVu Math TeX Gyre" w:eastAsia="楷体" w:cs="Times New Roman"/>
-                <w:i w:val="0"/>
-                <w:sz w:val="28"/>
-                <w:szCs w:val="28"/>
-                <w:highlight w:val="none"/>
-                <w:lang w:eastAsia="zh-CN"/>
-              </w:rPr>
-            </m:ctrlPr>
-          </m:sSubPr>
-          <m:e>
-            <m:r>
-              <m:rPr>
-                <m:sty m:val="p"/>
-              </m:rPr>
-              <w:rPr>
-                <w:rFonts w:hint="eastAsia" w:ascii="DejaVu Math TeX Gyre" w:hAnsi="DejaVu Math TeX Gyre" w:eastAsia="楷体" w:cs="Times New Roman"/>
-                <w:sz w:val="28"/>
-                <w:szCs w:val="28"/>
-                <w:highlight w:val="none"/>
-                <w:lang w:eastAsia="zh-CN"/>
-              </w:rPr>
-              <m:t>H</m:t>
-            </m:r>
-            <m:ctrlPr>
-              <w:rPr>
-                <w:rFonts w:hint="eastAsia" w:ascii="DejaVu Math TeX Gyre" w:hAnsi="DejaVu Math TeX Gyre" w:eastAsia="楷体" w:cs="Times New Roman"/>
-                <w:i w:val="0"/>
-                <w:sz w:val="28"/>
-                <w:szCs w:val="28"/>
-                <w:highlight w:val="none"/>
-                <w:lang w:eastAsia="zh-CN"/>
-              </w:rPr>
-            </m:ctrlPr>
-          </m:e>
-          <m:sub>
-            <m:r>
-              <m:rPr>
-                <m:sty m:val="p"/>
-              </m:rPr>
-              <w:rPr>
-                <w:rFonts w:hint="eastAsia" w:ascii="DejaVu Math TeX Gyre" w:hAnsi="DejaVu Math TeX Gyre" w:eastAsia="楷体" w:cs="Times New Roman"/>
-                <w:sz w:val="28"/>
-                <w:szCs w:val="28"/>
-                <w:highlight w:val="none"/>
-                <w:lang w:eastAsia="zh-CN"/>
-              </w:rPr>
-              <m:t>0</m:t>
-            </m:r>
-            <m:ctrlPr>
-              <w:rPr>
-                <w:rFonts w:hint="eastAsia" w:ascii="DejaVu Math TeX Gyre" w:hAnsi="DejaVu Math TeX Gyre" w:eastAsia="楷体" w:cs="Times New Roman"/>
-                <w:i w:val="0"/>
-                <w:sz w:val="28"/>
-                <w:szCs w:val="28"/>
-                <w:highlight w:val="none"/>
-                <w:lang w:eastAsia="zh-CN"/>
-              </w:rPr>
-            </m:ctrlPr>
-          </m:sub>
-        </m:sSub>
-      </m:oMath>
-      <w:r>
-        <w:rPr>
-          <w:rFonts w:hint="eastAsia" w:ascii="Times New Roman" w:hAnsi="Times New Roman" w:eastAsia="楷体" w:cs="Times New Roman"/>
-          <w:sz w:val="28"/>
-          <w:szCs w:val="28"/>
-        </w:rPr>
-        <w:t>是否小于或等于15%，若是，将q+1赋值给q，返回步骤S32，继续按距跨中由近及远的顺序对称浇筑下一组尚未浇筑的非吊索区湿接缝；若否，则判定预设跨中区段浇筑完成，并进入步骤S4。</w:t>
+        <w:t>；</w:t>
       </w:r>
     </w:p>
     <w:p>
@@ -1251,7 +1029,251 @@
           <w:sz w:val="28"/>
           <w:szCs w:val="28"/>
         </w:rPr>
-        <w:t>3.根据权利要求2所述的悬索桥钢混组合梁原位叠合浇筑施工方法，其特征在于，所述S4中由跨中向两侧索塔对第i浇筑批次的所述非吊索区湿接缝进行逐批次、对称且跳仓浇筑包括以下步骤：</w:t>
+        <w:t>S33、判断(</w:t>
+      </w:r>
+      <m:oMath>
+        <m:sSub>
+          <m:sSubPr>
+            <m:ctrlPr>
+              <w:rPr>
+                <w:rFonts w:hint="eastAsia" w:ascii="DejaVu Math TeX Gyre" w:hAnsi="DejaVu Math TeX Gyre" w:eastAsia="楷体" w:cs="Times New Roman"/>
+                <w:i w:val="0"/>
+                <w:sz w:val="28"/>
+                <w:szCs w:val="28"/>
+                <w:highlight w:val="none"/>
+                <w:lang w:eastAsia="zh-CN"/>
+              </w:rPr>
+            </m:ctrlPr>
+          </m:sSubPr>
+          <m:e>
+            <m:r>
+              <m:rPr>
+                <m:sty m:val="p"/>
+              </m:rPr>
+              <w:rPr>
+                <w:rFonts w:hint="eastAsia" w:ascii="DejaVu Math TeX Gyre" w:hAnsi="DejaVu Math TeX Gyre" w:eastAsia="楷体" w:cs="Times New Roman"/>
+                <w:sz w:val="28"/>
+                <w:szCs w:val="28"/>
+                <w:highlight w:val="none"/>
+                <w:lang w:eastAsia="zh-CN"/>
+              </w:rPr>
+              <m:t>H</m:t>
+            </m:r>
+            <m:ctrlPr>
+              <w:rPr>
+                <w:rFonts w:hint="eastAsia" w:ascii="DejaVu Math TeX Gyre" w:hAnsi="DejaVu Math TeX Gyre" w:eastAsia="楷体" w:cs="Times New Roman"/>
+                <w:i w:val="0"/>
+                <w:sz w:val="28"/>
+                <w:szCs w:val="28"/>
+                <w:highlight w:val="none"/>
+                <w:lang w:eastAsia="zh-CN"/>
+              </w:rPr>
+            </m:ctrlPr>
+          </m:e>
+          <m:sub>
+            <m:r>
+              <m:rPr>
+                <m:sty m:val="p"/>
+              </m:rPr>
+              <w:rPr>
+                <w:rFonts w:hint="default" w:ascii="DejaVu Math TeX Gyre" w:hAnsi="DejaVu Math TeX Gyre" w:eastAsia="楷体" w:cs="Times New Roman"/>
+                <w:sz w:val="28"/>
+                <w:szCs w:val="28"/>
+                <w:highlight w:val="none"/>
+                <w:lang w:val="en-US" w:eastAsia="zh-CN"/>
+              </w:rPr>
+              <m:t>1</m:t>
+            </m:r>
+            <m:ctrlPr>
+              <w:rPr>
+                <w:rFonts w:hint="eastAsia" w:ascii="DejaVu Math TeX Gyre" w:hAnsi="DejaVu Math TeX Gyre" w:eastAsia="楷体" w:cs="Times New Roman"/>
+                <w:i w:val="0"/>
+                <w:sz w:val="28"/>
+                <w:szCs w:val="28"/>
+                <w:highlight w:val="none"/>
+                <w:lang w:eastAsia="zh-CN"/>
+              </w:rPr>
+            </m:ctrlPr>
+          </m:sub>
+        </m:sSub>
+      </m:oMath>
+      <w:r>
+        <w:rPr>
+          <w:rFonts w:hint="eastAsia" w:ascii="Times New Roman" w:hAnsi="Times New Roman" w:eastAsia="楷体" w:cs="Times New Roman"/>
+          <w:sz w:val="28"/>
+          <w:szCs w:val="28"/>
+        </w:rPr>
+        <w:t>−</w:t>
+      </w:r>
+      <m:oMath>
+        <m:sSub>
+          <m:sSubPr>
+            <m:ctrlPr>
+              <w:rPr>
+                <w:rFonts w:hint="eastAsia" w:ascii="DejaVu Math TeX Gyre" w:hAnsi="DejaVu Math TeX Gyre" w:eastAsia="楷体" w:cs="Times New Roman"/>
+                <w:i w:val="0"/>
+                <w:sz w:val="28"/>
+                <w:szCs w:val="28"/>
+                <w:highlight w:val="none"/>
+                <w:lang w:eastAsia="zh-CN"/>
+              </w:rPr>
+            </m:ctrlPr>
+          </m:sSubPr>
+          <m:e>
+            <m:r>
+              <m:rPr>
+                <m:sty m:val="p"/>
+              </m:rPr>
+              <w:rPr>
+                <w:rFonts w:hint="eastAsia" w:ascii="DejaVu Math TeX Gyre" w:hAnsi="DejaVu Math TeX Gyre" w:eastAsia="楷体" w:cs="Times New Roman"/>
+                <w:sz w:val="28"/>
+                <w:szCs w:val="28"/>
+                <w:highlight w:val="none"/>
+                <w:lang w:eastAsia="zh-CN"/>
+              </w:rPr>
+              <m:t>H</m:t>
+            </m:r>
+            <m:ctrlPr>
+              <w:rPr>
+                <w:rFonts w:hint="eastAsia" w:ascii="DejaVu Math TeX Gyre" w:hAnsi="DejaVu Math TeX Gyre" w:eastAsia="楷体" w:cs="Times New Roman"/>
+                <w:i w:val="0"/>
+                <w:sz w:val="28"/>
+                <w:szCs w:val="28"/>
+                <w:highlight w:val="none"/>
+                <w:lang w:eastAsia="zh-CN"/>
+              </w:rPr>
+            </m:ctrlPr>
+          </m:e>
+          <m:sub>
+            <m:r>
+              <m:rPr>
+                <m:sty m:val="p"/>
+              </m:rPr>
+              <w:rPr>
+                <w:rFonts w:hint="eastAsia" w:ascii="DejaVu Math TeX Gyre" w:hAnsi="DejaVu Math TeX Gyre" w:eastAsia="楷体" w:cs="Times New Roman"/>
+                <w:sz w:val="28"/>
+                <w:szCs w:val="28"/>
+                <w:highlight w:val="none"/>
+                <w:lang w:eastAsia="zh-CN"/>
+              </w:rPr>
+              <m:t>0</m:t>
+            </m:r>
+            <m:ctrlPr>
+              <w:rPr>
+                <w:rFonts w:hint="eastAsia" w:ascii="DejaVu Math TeX Gyre" w:hAnsi="DejaVu Math TeX Gyre" w:eastAsia="楷体" w:cs="Times New Roman"/>
+                <w:i w:val="0"/>
+                <w:sz w:val="28"/>
+                <w:szCs w:val="28"/>
+                <w:highlight w:val="none"/>
+                <w:lang w:eastAsia="zh-CN"/>
+              </w:rPr>
+            </m:ctrlPr>
+          </m:sub>
+        </m:sSub>
+      </m:oMath>
+      <w:r>
+        <w:rPr>
+          <w:rFonts w:hint="eastAsia" w:ascii="Times New Roman" w:hAnsi="Times New Roman" w:eastAsia="楷体" w:cs="Times New Roman"/>
+          <w:sz w:val="28"/>
+          <w:szCs w:val="28"/>
+        </w:rPr>
+        <w:t>)/</w:t>
+      </w:r>
+      <m:oMath>
+        <m:sSub>
+          <m:sSubPr>
+            <m:ctrlPr>
+              <w:rPr>
+                <w:rFonts w:hint="eastAsia" w:ascii="DejaVu Math TeX Gyre" w:hAnsi="DejaVu Math TeX Gyre" w:eastAsia="楷体" w:cs="Times New Roman"/>
+                <w:i w:val="0"/>
+                <w:sz w:val="28"/>
+                <w:szCs w:val="28"/>
+                <w:highlight w:val="none"/>
+                <w:lang w:eastAsia="zh-CN"/>
+              </w:rPr>
+            </m:ctrlPr>
+          </m:sSubPr>
+          <m:e>
+            <m:r>
+              <m:rPr>
+                <m:sty m:val="p"/>
+              </m:rPr>
+              <w:rPr>
+                <w:rFonts w:hint="eastAsia" w:ascii="DejaVu Math TeX Gyre" w:hAnsi="DejaVu Math TeX Gyre" w:eastAsia="楷体" w:cs="Times New Roman"/>
+                <w:sz w:val="28"/>
+                <w:szCs w:val="28"/>
+                <w:highlight w:val="none"/>
+                <w:lang w:eastAsia="zh-CN"/>
+              </w:rPr>
+              <m:t>H</m:t>
+            </m:r>
+            <m:ctrlPr>
+              <w:rPr>
+                <w:rFonts w:hint="eastAsia" w:ascii="DejaVu Math TeX Gyre" w:hAnsi="DejaVu Math TeX Gyre" w:eastAsia="楷体" w:cs="Times New Roman"/>
+                <w:i w:val="0"/>
+                <w:sz w:val="28"/>
+                <w:szCs w:val="28"/>
+                <w:highlight w:val="none"/>
+                <w:lang w:eastAsia="zh-CN"/>
+              </w:rPr>
+            </m:ctrlPr>
+          </m:e>
+          <m:sub>
+            <m:r>
+              <m:rPr>
+                <m:sty m:val="p"/>
+              </m:rPr>
+              <w:rPr>
+                <w:rFonts w:hint="eastAsia" w:ascii="DejaVu Math TeX Gyre" w:hAnsi="DejaVu Math TeX Gyre" w:eastAsia="楷体" w:cs="Times New Roman"/>
+                <w:sz w:val="28"/>
+                <w:szCs w:val="28"/>
+                <w:highlight w:val="none"/>
+                <w:lang w:eastAsia="zh-CN"/>
+              </w:rPr>
+              <m:t>0</m:t>
+            </m:r>
+            <m:ctrlPr>
+              <w:rPr>
+                <w:rFonts w:hint="eastAsia" w:ascii="DejaVu Math TeX Gyre" w:hAnsi="DejaVu Math TeX Gyre" w:eastAsia="楷体" w:cs="Times New Roman"/>
+                <w:i w:val="0"/>
+                <w:sz w:val="28"/>
+                <w:szCs w:val="28"/>
+                <w:highlight w:val="none"/>
+                <w:lang w:eastAsia="zh-CN"/>
+              </w:rPr>
+            </m:ctrlPr>
+          </m:sub>
+        </m:sSub>
+      </m:oMath>
+      <w:r>
+        <w:rPr>
+          <w:rFonts w:hint="eastAsia" w:ascii="Times New Roman" w:hAnsi="Times New Roman" w:eastAsia="楷体" w:cs="Times New Roman"/>
+          <w:sz w:val="28"/>
+          <w:szCs w:val="28"/>
+        </w:rPr>
+        <w:t>是否小于或等于15%，若是，将q+1赋值给q，返回步骤S32，继续按距跨中由近及远的顺序对称浇筑下一组尚未浇筑的非吊索区湿接缝；若否，则判定预设跨中区段浇筑完成，并进入步骤S4。</w:t>
+      </w:r>
+    </w:p>
+    <w:p>
+      <w:pPr>
+        <w:pStyle w:val="4"/>
+        <w:widowControl w:val="0"/>
+        <w:spacing w:line="500" w:lineRule="exact"/>
+        <w:ind w:firstLine="560" w:firstLineChars="200"/>
+        <w:jc w:val="both"/>
+        <w:rPr>
+          <w:rFonts w:hint="eastAsia" w:eastAsia="楷体" w:cs="Times New Roman"/>
+          <w:sz w:val="28"/>
+          <w:szCs w:val="28"/>
+        </w:rPr>
+      </w:pPr>
+      <w:r>
+        <w:rPr>
+          <w:rFonts w:hint="eastAsia" w:ascii="Times New Roman" w:hAnsi="Times New Roman" w:eastAsia="楷体" w:cs="Times New Roman"/>
+          <w:sz w:val="28"/>
+          <w:szCs w:val="28"/>
+        </w:rPr>
+        <w:t>4.根据权利要求3所述的悬索桥钢混组合梁原位叠合浇筑施工方法，其特征在于，所述S4中由跨中向两侧索塔对第i浇筑批次的所述非吊索区湿接缝进行逐批次、对称且跳仓浇筑包括以下步骤：</w:t>
       </w:r>
     </w:p>
     <w:p>
@@ -2173,7 +2195,7 @@
           <w:sz w:val="28"/>
           <w:szCs w:val="28"/>
         </w:rPr>
-        <w:t>4.根据权利要求1所述的悬索桥钢混组合梁原位叠合浇筑施工方法，其特征在于，所述S6中，在所述第一阶段的湿接缝混凝土达到预设强度、且主缆线形达到预设指标后开始所述第二阶段浇筑；所述预设指标为：所述第一阶段连续三个浇筑批次中，每一批次结束后的跨中竖向位移变化量Δv均满足|Δv|≤3mm，且每一批次结束后的索塔塔顶纵向位移变化量均≤5mm。</w:t>
+        <w:t>5.根据权利要求1所述的悬索桥钢混组合梁原位叠合浇筑施工方法，其特征在于，所述S6中，在所述第一阶段的湿接缝混凝土达到预设强度、且主缆线形达到预设指标后开始所述第二阶段浇筑；所述预设指标为：所述第一阶段连续三个浇筑批次中，每一批次结束后的跨中竖向位移变化量Δv均满足|Δv|≤3mm，且每一批次结束后的索塔塔顶纵向位移变化量均≤5mm。</w:t>
       </w:r>
     </w:p>
     <w:p>
@@ -2195,7 +2217,7 @@
           <w:sz w:val="28"/>
           <w:szCs w:val="28"/>
         </w:rPr>
-        <w:t>5.根据权利要求1所述的悬索桥钢混组合梁原位叠合浇筑施工方法，其特征在于，所述S6中，在第N浇筑批次为所述第二阶段最末一批次之前，先执行以下步骤：</w:t>
+        <w:t>6.根据权利要求1所述的悬索桥钢混组合梁原位叠合浇筑施工方法，其特征在于，所述S6中，在第N浇筑批次为所述第二阶段最末一批次之前，先执行以下步骤：</w:t>
       </w:r>
     </w:p>
     <w:p>
@@ -2431,7 +2453,7 @@
           <w:sz w:val="28"/>
           <w:szCs w:val="28"/>
         </w:rPr>
-        <w:t>6.根据权利要求1所述的悬索桥钢混组合梁原位叠合浇筑施工方法，其特征在于，还包括以下步骤：</w:t>
+        <w:t>7.根据权利要求1所述的悬索桥钢混组合梁原位叠合浇筑施工方法，其特征在于，还包括以下步骤：</w:t>
       </w:r>
     </w:p>
     <w:p>
@@ -2924,7 +2946,7 @@
           <w:sz w:val="28"/>
           <w:szCs w:val="28"/>
         </w:rPr>
-        <w:t>7.根据权利要求6所述的悬索桥钢混组合梁原位叠合浇筑施工方法，其特征在于，所述预设阈值为L/10000，L为所述主缆跨度；在所述</w:t>
+        <w:t>8.根据权利要求7所述的悬索桥钢混组合梁原位叠合浇筑施工方法，其特征在于，所述预设阈值为L/10000，L为所述主缆跨度；在所述</w:t>
       </w:r>
       <m:oMath>
         <m:sSub>
@@ -3354,7 +3376,7 @@
           <w:sz w:val="28"/>
           <w:szCs w:val="28"/>
         </w:rPr>
-        <w:t>8.根据权利要求1至7中任一项所述的悬索桥钢混组合梁原位叠合浇筑施工方法，其特征在于，所述湿接缝混凝土的强度等级不低于所述预制混凝土桥面板的强度等级。</w:t>
+        <w:t>9.根据权利要求1至8中任一项所述的悬索桥钢混组合梁原位叠合浇筑施工方法，其特征在于，所述湿接缝混凝土的强度等级不低于所述预制混凝土桥面板的强度等级。</w:t>
       </w:r>
     </w:p>
     <w:p>
@@ -3376,7 +3398,7 @@
           <w:sz w:val="28"/>
           <w:szCs w:val="28"/>
         </w:rPr>
-        <w:t>9.根据权利要求1所述的悬索桥钢混组合梁原位叠合浇筑施工方法，其特征在于，所述预设范围为吊索中心线两侧各1.25m。</w:t>
+        <w:t>10.根据权利要求2所述的悬索桥钢混组合梁原位叠合浇筑施工方法，其特征在于，所述预设范围为吊索中心线两侧各1.25m。</w:t>
       </w:r>
     </w:p>
     <w:p>
@@ -3398,7 +3420,7 @@
           <w:sz w:val="28"/>
           <w:szCs w:val="28"/>
         </w:rPr>
-        <w:t>10.根据权利要求1所述的悬索桥钢混组合梁原位叠合浇筑施工方法，其特征在于，所述第一阶段分为10-12个浇筑批次完成，每一批次的浇筑方量与设计方量之差的绝对值不超过设计方量的5%。</w:t>
+        <w:t>11.根据权利要求1所述的悬索桥钢混组合梁原位叠合浇筑施工方法，其特征在于，所述第一阶段分为10-12个浇筑批次完成，每一批次的浇筑方量与设计方量之差的绝对值不超过设计方量的5%。</w:t>
       </w:r>
     </w:p>
     <w:p>
@@ -3984,7 +4006,7 @@
           <w:sz w:val="28"/>
           <w:szCs w:val="28"/>
         </w:rPr>
-        <w:t>S2、将所述湿接缝划分为吊索区湿接缝和其余非吊索区湿接缝；所述吊索区湿接缝为位于吊索中心线两侧预设范围内的湿接缝；所述非吊索区湿接缝为除所述吊索区湿接缝以外的湿接缝；</w:t>
+        <w:t>S2、将所述湿接缝划分为吊索区湿接缝和其余非吊索区湿接缝；</w:t>
       </w:r>
     </w:p>
     <w:p>
@@ -4006,7 +4028,7 @@
           <w:sz w:val="28"/>
           <w:szCs w:val="28"/>
         </w:rPr>
-        <w:t>S3、开始第一阶段浇筑，先浇筑预设跨中区段的所述非吊索区湿接缝；其中，所述跨中区段为以跨中为中心对称延伸的区段；</w:t>
+        <w:t>S3、开始第一阶段浇筑，先浇筑预设跨中区段的所述非吊索区湿接缝；</w:t>
       </w:r>
     </w:p>
     <w:p>
@@ -4028,7 +4050,7 @@
           <w:sz w:val="28"/>
           <w:szCs w:val="28"/>
         </w:rPr>
-        <w:t>S4、再由跨中向两侧索塔对第i浇筑批次的所述非吊索区湿接缝进行逐批次、对称且跳仓浇筑；其中，i≥1，i为正整数，i的起始值为1；所述跳仓浇筑为沿桥纵向间隔至少一个吊索节段浇筑，所述吊索节段为相邻两吊索之间区段；</w:t>
+        <w:t>S4、再由跨中向两侧索塔对第i浇筑批次的所述非吊索区湿接缝进行逐批次、对称且跳仓浇筑；其中，i为正整数，i的起始值为1；</w:t>
       </w:r>
     </w:p>
     <w:p>
@@ -4072,7 +4094,7 @@
           <w:sz w:val="28"/>
           <w:szCs w:val="28"/>
         </w:rPr>
-        <w:t>S6、判断所述第一阶段的湿接缝混凝土是否达到预设强度，若否，待所述湿接缝混凝土达到预设强度后开始第二阶段浇筑；若是，开始第二阶段浇筑；所述第二阶段由跨中向两侧索塔对称浇筑第N浇筑批次的所述吊索区湿接缝；其中，N≥1，N为正整数，N的起始值为1；</w:t>
+        <w:t>S6、待所述第一阶段的湿接缝混凝土达到预设强度后，开始第二阶段浇筑，由跨中向两侧索塔对称浇筑第N浇筑批次的所述吊索区湿接缝；其中，N为正整数，N的起始值为1；</w:t>
       </w:r>
     </w:p>
     <w:p>
@@ -4095,6 +4117,28 @@
           <w:szCs w:val="28"/>
         </w:rPr>
         <w:t>S7、判断第N浇筑批次完成后是否仍存在尚未浇筑的吊索区湿接缝，若是，将N+1赋值给N，返回步骤S6中所述第二阶段浇筑；若否，全桥湿接缝浇筑完成并形成组合截面。</w:t>
+      </w:r>
+    </w:p>
+    <w:p>
+      <w:pPr>
+        <w:pStyle w:val="4"/>
+        <w:widowControl w:val="0"/>
+        <w:spacing w:line="500" w:lineRule="exact"/>
+        <w:ind w:firstLine="560" w:firstLineChars="200"/>
+        <w:jc w:val="both"/>
+        <w:rPr>
+          <w:rFonts w:hint="eastAsia" w:eastAsia="楷体" w:cs="Times New Roman"/>
+          <w:sz w:val="28"/>
+          <w:szCs w:val="28"/>
+        </w:rPr>
+      </w:pPr>
+      <w:r>
+        <w:rPr>
+          <w:rFonts w:hint="eastAsia" w:ascii="Times New Roman" w:hAnsi="Times New Roman" w:eastAsia="楷体" w:cs="Times New Roman"/>
+          <w:sz w:val="28"/>
+          <w:szCs w:val="28"/>
+        </w:rPr>
+        <w:t>进一步地，所述吊索区湿接缝为位于吊索中心线两侧预设范围内的湿接缝；所述非吊索区湿接缝为除所述吊索区湿接缝以外的湿接缝；所述跨中区段为以跨中为中心对称延伸的区段；所述跳仓浇筑为沿桥纵向间隔至少一个吊索节段浇筑，所述吊索节段为相邻两吊索之间区段。</w:t>
       </w:r>
     </w:p>
     <w:p>
@@ -7230,7 +7274,7 @@
           <w:sz w:val="28"/>
           <w:szCs w:val="28"/>
         </w:rPr>
-        <w:t>S2、将所述湿接缝划分为吊索区湿接缝和其余非吊索区湿接缝；所述吊索区湿接缝为位于吊索中心线两侧预设范围内的湿接缝；所述非吊索区湿接缝为除所述吊索区湿接缝以外的湿接缝；</w:t>
+        <w:t>S2、将所述湿接缝划分为吊索区湿接缝和其余非吊索区湿接缝；</w:t>
       </w:r>
     </w:p>
     <w:p>
@@ -7252,7 +7296,7 @@
           <w:sz w:val="28"/>
           <w:szCs w:val="28"/>
         </w:rPr>
-        <w:t>S3、开始第一阶段浇筑，先浇筑预设跨中区段的所述非吊索区湿接缝；其中，所述跨中区段为以跨中为中心对称延伸的区段；</w:t>
+        <w:t>S3、开始第一阶段浇筑，先浇筑预设跨中区段的所述非吊索区湿接缝；</w:t>
       </w:r>
     </w:p>
     <w:p>
@@ -7274,7 +7318,7 @@
           <w:sz w:val="28"/>
           <w:szCs w:val="28"/>
         </w:rPr>
-        <w:t>S4、再由跨中向两侧索塔对第i浇筑批次的所述非吊索区湿接缝进行逐批次、对称且跳仓浇筑；其中，i≥1，i为正整数，i的起始值为1；所述跳仓浇筑为沿桥纵向间隔至少一个吊索节段浇筑，所述吊索节段为相邻两吊索之间区段；</w:t>
+        <w:t>S4、再由跨中向两侧索塔对第i浇筑批次的所述非吊索区湿接缝进行逐批次、对称且跳仓浇筑；其中，i为正整数，i的起始值为1；</w:t>
       </w:r>
     </w:p>
     <w:p>
@@ -7318,7 +7362,7 @@
           <w:sz w:val="28"/>
           <w:szCs w:val="28"/>
         </w:rPr>
-        <w:t>S6、判断所述第一阶段的湿接缝混凝土是否达到预设强度，若否，待所述湿接缝混凝土达到预设强度后开始第二阶段浇筑；若是，开始第二阶段浇筑；所述第二阶段由跨中向两侧索塔对称浇筑第N浇筑批次的所述吊索区湿接缝；其中，N≥1，N为正整数，N的起始值为1；</w:t>
+        <w:t>S6、待所述第一阶段的湿接缝混凝土达到预设强度后，开始第二阶段浇筑，由跨中向两侧索塔对称浇筑第N浇筑批次的所述吊索区湿接缝；其中，N为正整数，N的起始值为1；</w:t>
       </w:r>
     </w:p>
     <w:p>

</xml_diff>

<commit_message>
Restore claim 1 definitions so the independent claim is self-contained.
Put hanger-zone, midspan section, and skip-pour meanings back in claim 1
and drop the separate definition claim that left those terms unclear.

Co-authored-by: 2427613265-ai <2427613265-ai@users.noreply.github.com>
</commit_message>
<xml_diff>
--- a/docs/PA26-1238-I-A_权利要求书优化稿.docx
+++ b/docs/PA26-1238-I-A_权利要求书优化稿.docx
@@ -647,7 +647,7 @@
           <w:sz w:val="28"/>
           <w:szCs w:val="28"/>
         </w:rPr>
-        <w:t>S2、将所述湿接缝划分为吊索区湿接缝和非吊索区湿接缝；</w:t>
+        <w:t>S2、将所述湿接缝划分为吊索区湿接缝和非吊索区湿接缝；所述吊索区湿接缝为位于吊索的中心线两侧预设范围内的湿接缝；所述非吊索区湿接缝为除所述吊索区湿接缝以外的湿接缝；</w:t>
       </w:r>
     </w:p>
     <w:p>
@@ -669,7 +669,7 @@
           <w:sz w:val="28"/>
           <w:szCs w:val="28"/>
         </w:rPr>
-        <w:t>S3、开始第一阶段浇筑，先浇筑预设跨中区段的所述非吊索区湿接缝；</w:t>
+        <w:t>S3、开始第一阶段浇筑，先浇筑预设跨中区段的所述非吊索区湿接缝；其中，所述跨中区段为以跨中为中心对称延伸的区段；</w:t>
       </w:r>
     </w:p>
     <w:p>
@@ -691,7 +691,7 @@
           <w:sz w:val="28"/>
           <w:szCs w:val="28"/>
         </w:rPr>
-        <w:t>S4、再由跨中向两侧索塔对第i浇筑批次的所述非吊索区湿接缝进行逐批次、对称且跳仓浇筑；其中，i为正整数，i的起始值为1；</w:t>
+        <w:t>S4、再由跨中向两侧索塔对第i浇筑批次的所述非吊索区湿接缝进行逐批次、对称且跳仓浇筑；其中，i为正整数，i的起始值为1；所述跳仓浇筑为沿纵桥向间隔至少一个吊索节段浇筑，所述吊索节段为相邻两吊索之间区段；</w:t>
       </w:r>
     </w:p>
     <w:p>
@@ -793,7 +793,7 @@
           <w:sz w:val="28"/>
           <w:szCs w:val="28"/>
         </w:rPr>
-        <w:t>2.根据权利要求1所述的悬索桥钢混组合梁原位叠合浇筑施工方法，其特征在于，所述吊索区湿接缝为位于吊索的中心线两侧预设范围内的湿接缝；所述非吊索区湿接缝为除所述吊索区湿接缝以外的湿接缝；所述跨中区段为以跨中为中心对称延伸的区段；所述跳仓浇筑为沿纵桥向间隔至少一个吊索节段浇筑，所述吊索节段为相邻两吊索之间区段。</w:t>
+        <w:t>2.根据权利要求1所述的悬索桥钢混组合梁原位叠合浇筑施工方法，其特征在于，所述S3中先浇筑预设跨中区段的所述非吊索区湿接缝包括以下步骤：</w:t>
       </w:r>
     </w:p>
     <w:p>
@@ -815,7 +815,81 @@
           <w:sz w:val="28"/>
           <w:szCs w:val="28"/>
         </w:rPr>
-        <w:t>3.根据权利要求1所述的悬索桥钢混组合梁原位叠合浇筑施工方法，其特征在于，所述S3中先浇筑预设跨中区段的所述非吊索区湿接缝包括以下步骤：</w:t>
+        <w:t>S31、以主缆跨中为起点，在浇筑前获得初始主缆水平张力</w:t>
+      </w:r>
+      <m:oMath>
+        <m:sSub>
+          <m:sSubPr>
+            <m:ctrlPr>
+              <w:rPr>
+                <w:rFonts w:hint="eastAsia" w:ascii="DejaVu Math TeX Gyre" w:hAnsi="DejaVu Math TeX Gyre" w:eastAsia="楷体" w:cs="Times New Roman"/>
+                <w:i w:val="0"/>
+                <w:sz w:val="28"/>
+                <w:szCs w:val="28"/>
+                <w:highlight w:val="none"/>
+                <w:lang w:eastAsia="zh-CN"/>
+              </w:rPr>
+            </m:ctrlPr>
+          </m:sSubPr>
+          <m:e>
+            <m:r>
+              <m:rPr>
+                <m:sty m:val="p"/>
+              </m:rPr>
+              <w:rPr>
+                <w:rFonts w:hint="eastAsia" w:ascii="DejaVu Math TeX Gyre" w:hAnsi="DejaVu Math TeX Gyre" w:eastAsia="楷体" w:cs="Times New Roman"/>
+                <w:sz w:val="28"/>
+                <w:szCs w:val="28"/>
+                <w:highlight w:val="none"/>
+                <w:lang w:eastAsia="zh-CN"/>
+              </w:rPr>
+              <m:t>H</m:t>
+            </m:r>
+            <m:ctrlPr>
+              <w:rPr>
+                <w:rFonts w:hint="eastAsia" w:ascii="DejaVu Math TeX Gyre" w:hAnsi="DejaVu Math TeX Gyre" w:eastAsia="楷体" w:cs="Times New Roman"/>
+                <w:i w:val="0"/>
+                <w:sz w:val="28"/>
+                <w:szCs w:val="28"/>
+                <w:highlight w:val="none"/>
+                <w:lang w:eastAsia="zh-CN"/>
+              </w:rPr>
+            </m:ctrlPr>
+          </m:e>
+          <m:sub>
+            <m:r>
+              <m:rPr>
+                <m:sty m:val="p"/>
+              </m:rPr>
+              <w:rPr>
+                <w:rFonts w:hint="eastAsia" w:ascii="DejaVu Math TeX Gyre" w:hAnsi="DejaVu Math TeX Gyre" w:eastAsia="楷体" w:cs="Times New Roman"/>
+                <w:sz w:val="28"/>
+                <w:szCs w:val="28"/>
+                <w:highlight w:val="none"/>
+                <w:lang w:eastAsia="zh-CN"/>
+              </w:rPr>
+              <m:t>0</m:t>
+            </m:r>
+            <m:ctrlPr>
+              <w:rPr>
+                <w:rFonts w:hint="eastAsia" w:ascii="DejaVu Math TeX Gyre" w:hAnsi="DejaVu Math TeX Gyre" w:eastAsia="楷体" w:cs="Times New Roman"/>
+                <w:i w:val="0"/>
+                <w:sz w:val="28"/>
+                <w:szCs w:val="28"/>
+                <w:highlight w:val="none"/>
+                <w:lang w:eastAsia="zh-CN"/>
+              </w:rPr>
+            </m:ctrlPr>
+          </m:sub>
+        </m:sSub>
+      </m:oMath>
+      <w:r>
+        <w:rPr>
+          <w:rFonts w:hint="eastAsia" w:ascii="Times New Roman" w:hAnsi="Times New Roman" w:eastAsia="楷体" w:cs="Times New Roman"/>
+          <w:sz w:val="28"/>
+          <w:szCs w:val="28"/>
+        </w:rPr>
+        <w:t>，作为跨中区段扩展的张力基准；令q≥1，q为正整数，q的起始值为1；</w:t>
       </w:r>
     </w:p>
     <w:p>
@@ -837,7 +911,7 @@
           <w:sz w:val="28"/>
           <w:szCs w:val="28"/>
         </w:rPr>
-        <w:t>S31、以主缆跨中为起点，在浇筑前获得初始主缆水平张力</w:t>
+        <w:t>S32、由跨中向两侧索塔方向，按距跨中由近及远的顺序，对称选取一组尚未浇筑的非吊索区湿接缝作为第q次浇筑对象并浇筑，获得浇筑后的当前主缆水平张力</w:t>
       </w:r>
       <m:oMath>
         <m:sSub>
@@ -884,13 +958,13 @@
                 <m:sty m:val="p"/>
               </m:rPr>
               <w:rPr>
-                <w:rFonts w:hint="eastAsia" w:ascii="DejaVu Math TeX Gyre" w:hAnsi="DejaVu Math TeX Gyre" w:eastAsia="楷体" w:cs="Times New Roman"/>
-                <w:sz w:val="28"/>
-                <w:szCs w:val="28"/>
-                <w:highlight w:val="none"/>
-                <w:lang w:eastAsia="zh-CN"/>
-              </w:rPr>
-              <m:t>0</m:t>
+                <w:rFonts w:hint="default" w:ascii="DejaVu Math TeX Gyre" w:hAnsi="DejaVu Math TeX Gyre" w:eastAsia="楷体" w:cs="Times New Roman"/>
+                <w:sz w:val="28"/>
+                <w:szCs w:val="28"/>
+                <w:highlight w:val="none"/>
+                <w:lang w:val="en-US" w:eastAsia="zh-CN"/>
+              </w:rPr>
+              <m:t>1</m:t>
             </m:r>
             <m:ctrlPr>
               <w:rPr>
@@ -911,7 +985,7 @@
           <w:sz w:val="28"/>
           <w:szCs w:val="28"/>
         </w:rPr>
-        <w:t>，作为跨中区段扩展的张力基准；令q≥1，q为正整数，q的起始值为1；</w:t>
+        <w:t>；</w:t>
       </w:r>
     </w:p>
     <w:p>
@@ -933,7 +1007,7 @@
           <w:sz w:val="28"/>
           <w:szCs w:val="28"/>
         </w:rPr>
-        <w:t>S32、由跨中向两侧索塔方向，按距跨中由近及远的顺序，对称选取一组尚未浇筑的非吊索区湿接缝作为第q次浇筑对象并浇筑，获得浇筑后的当前主缆水平张力</w:t>
+        <w:t>S33、判断(</w:t>
       </w:r>
       <m:oMath>
         <m:sSub>
@@ -1007,7 +1081,155 @@
           <w:sz w:val="28"/>
           <w:szCs w:val="28"/>
         </w:rPr>
-        <w:t>；</w:t>
+        <w:t>−</w:t>
+      </w:r>
+      <m:oMath>
+        <m:sSub>
+          <m:sSubPr>
+            <m:ctrlPr>
+              <w:rPr>
+                <w:rFonts w:hint="eastAsia" w:ascii="DejaVu Math TeX Gyre" w:hAnsi="DejaVu Math TeX Gyre" w:eastAsia="楷体" w:cs="Times New Roman"/>
+                <w:i w:val="0"/>
+                <w:sz w:val="28"/>
+                <w:szCs w:val="28"/>
+                <w:highlight w:val="none"/>
+                <w:lang w:eastAsia="zh-CN"/>
+              </w:rPr>
+            </m:ctrlPr>
+          </m:sSubPr>
+          <m:e>
+            <m:r>
+              <m:rPr>
+                <m:sty m:val="p"/>
+              </m:rPr>
+              <w:rPr>
+                <w:rFonts w:hint="eastAsia" w:ascii="DejaVu Math TeX Gyre" w:hAnsi="DejaVu Math TeX Gyre" w:eastAsia="楷体" w:cs="Times New Roman"/>
+                <w:sz w:val="28"/>
+                <w:szCs w:val="28"/>
+                <w:highlight w:val="none"/>
+                <w:lang w:eastAsia="zh-CN"/>
+              </w:rPr>
+              <m:t>H</m:t>
+            </m:r>
+            <m:ctrlPr>
+              <w:rPr>
+                <w:rFonts w:hint="eastAsia" w:ascii="DejaVu Math TeX Gyre" w:hAnsi="DejaVu Math TeX Gyre" w:eastAsia="楷体" w:cs="Times New Roman"/>
+                <w:i w:val="0"/>
+                <w:sz w:val="28"/>
+                <w:szCs w:val="28"/>
+                <w:highlight w:val="none"/>
+                <w:lang w:eastAsia="zh-CN"/>
+              </w:rPr>
+            </m:ctrlPr>
+          </m:e>
+          <m:sub>
+            <m:r>
+              <m:rPr>
+                <m:sty m:val="p"/>
+              </m:rPr>
+              <w:rPr>
+                <w:rFonts w:hint="eastAsia" w:ascii="DejaVu Math TeX Gyre" w:hAnsi="DejaVu Math TeX Gyre" w:eastAsia="楷体" w:cs="Times New Roman"/>
+                <w:sz w:val="28"/>
+                <w:szCs w:val="28"/>
+                <w:highlight w:val="none"/>
+                <w:lang w:eastAsia="zh-CN"/>
+              </w:rPr>
+              <m:t>0</m:t>
+            </m:r>
+            <m:ctrlPr>
+              <w:rPr>
+                <w:rFonts w:hint="eastAsia" w:ascii="DejaVu Math TeX Gyre" w:hAnsi="DejaVu Math TeX Gyre" w:eastAsia="楷体" w:cs="Times New Roman"/>
+                <w:i w:val="0"/>
+                <w:sz w:val="28"/>
+                <w:szCs w:val="28"/>
+                <w:highlight w:val="none"/>
+                <w:lang w:eastAsia="zh-CN"/>
+              </w:rPr>
+            </m:ctrlPr>
+          </m:sub>
+        </m:sSub>
+      </m:oMath>
+      <w:r>
+        <w:rPr>
+          <w:rFonts w:hint="eastAsia" w:ascii="Times New Roman" w:hAnsi="Times New Roman" w:eastAsia="楷体" w:cs="Times New Roman"/>
+          <w:sz w:val="28"/>
+          <w:szCs w:val="28"/>
+        </w:rPr>
+        <w:t>)/</w:t>
+      </w:r>
+      <m:oMath>
+        <m:sSub>
+          <m:sSubPr>
+            <m:ctrlPr>
+              <w:rPr>
+                <w:rFonts w:hint="eastAsia" w:ascii="DejaVu Math TeX Gyre" w:hAnsi="DejaVu Math TeX Gyre" w:eastAsia="楷体" w:cs="Times New Roman"/>
+                <w:i w:val="0"/>
+                <w:sz w:val="28"/>
+                <w:szCs w:val="28"/>
+                <w:highlight w:val="none"/>
+                <w:lang w:eastAsia="zh-CN"/>
+              </w:rPr>
+            </m:ctrlPr>
+          </m:sSubPr>
+          <m:e>
+            <m:r>
+              <m:rPr>
+                <m:sty m:val="p"/>
+              </m:rPr>
+              <w:rPr>
+                <w:rFonts w:hint="eastAsia" w:ascii="DejaVu Math TeX Gyre" w:hAnsi="DejaVu Math TeX Gyre" w:eastAsia="楷体" w:cs="Times New Roman"/>
+                <w:sz w:val="28"/>
+                <w:szCs w:val="28"/>
+                <w:highlight w:val="none"/>
+                <w:lang w:eastAsia="zh-CN"/>
+              </w:rPr>
+              <m:t>H</m:t>
+            </m:r>
+            <m:ctrlPr>
+              <w:rPr>
+                <w:rFonts w:hint="eastAsia" w:ascii="DejaVu Math TeX Gyre" w:hAnsi="DejaVu Math TeX Gyre" w:eastAsia="楷体" w:cs="Times New Roman"/>
+                <w:i w:val="0"/>
+                <w:sz w:val="28"/>
+                <w:szCs w:val="28"/>
+                <w:highlight w:val="none"/>
+                <w:lang w:eastAsia="zh-CN"/>
+              </w:rPr>
+            </m:ctrlPr>
+          </m:e>
+          <m:sub>
+            <m:r>
+              <m:rPr>
+                <m:sty m:val="p"/>
+              </m:rPr>
+              <w:rPr>
+                <w:rFonts w:hint="eastAsia" w:ascii="DejaVu Math TeX Gyre" w:hAnsi="DejaVu Math TeX Gyre" w:eastAsia="楷体" w:cs="Times New Roman"/>
+                <w:sz w:val="28"/>
+                <w:szCs w:val="28"/>
+                <w:highlight w:val="none"/>
+                <w:lang w:eastAsia="zh-CN"/>
+              </w:rPr>
+              <m:t>0</m:t>
+            </m:r>
+            <m:ctrlPr>
+              <w:rPr>
+                <w:rFonts w:hint="eastAsia" w:ascii="DejaVu Math TeX Gyre" w:hAnsi="DejaVu Math TeX Gyre" w:eastAsia="楷体" w:cs="Times New Roman"/>
+                <w:i w:val="0"/>
+                <w:sz w:val="28"/>
+                <w:szCs w:val="28"/>
+                <w:highlight w:val="none"/>
+                <w:lang w:eastAsia="zh-CN"/>
+              </w:rPr>
+            </m:ctrlPr>
+          </m:sub>
+        </m:sSub>
+      </m:oMath>
+      <w:r>
+        <w:rPr>
+          <w:rFonts w:hint="eastAsia" w:ascii="Times New Roman" w:hAnsi="Times New Roman" w:eastAsia="楷体" w:cs="Times New Roman"/>
+          <w:sz w:val="28"/>
+          <w:szCs w:val="28"/>
+        </w:rPr>
+        <w:t>是否小于或等于15%，若是，将q+1赋值给q，返回步骤S32，继续按距跨中由近及远的顺序对称浇筑下一组尚未浇筑的非吊索区湿接缝；若否，则判定预设跨中区段浇筑完成，并进入步骤S4。</w:t>
       </w:r>
     </w:p>
     <w:p>
@@ -1029,251 +1251,7 @@
           <w:sz w:val="28"/>
           <w:szCs w:val="28"/>
         </w:rPr>
-        <w:t>S33、判断(</w:t>
-      </w:r>
-      <m:oMath>
-        <m:sSub>
-          <m:sSubPr>
-            <m:ctrlPr>
-              <w:rPr>
-                <w:rFonts w:hint="eastAsia" w:ascii="DejaVu Math TeX Gyre" w:hAnsi="DejaVu Math TeX Gyre" w:eastAsia="楷体" w:cs="Times New Roman"/>
-                <w:i w:val="0"/>
-                <w:sz w:val="28"/>
-                <w:szCs w:val="28"/>
-                <w:highlight w:val="none"/>
-                <w:lang w:eastAsia="zh-CN"/>
-              </w:rPr>
-            </m:ctrlPr>
-          </m:sSubPr>
-          <m:e>
-            <m:r>
-              <m:rPr>
-                <m:sty m:val="p"/>
-              </m:rPr>
-              <w:rPr>
-                <w:rFonts w:hint="eastAsia" w:ascii="DejaVu Math TeX Gyre" w:hAnsi="DejaVu Math TeX Gyre" w:eastAsia="楷体" w:cs="Times New Roman"/>
-                <w:sz w:val="28"/>
-                <w:szCs w:val="28"/>
-                <w:highlight w:val="none"/>
-                <w:lang w:eastAsia="zh-CN"/>
-              </w:rPr>
-              <m:t>H</m:t>
-            </m:r>
-            <m:ctrlPr>
-              <w:rPr>
-                <w:rFonts w:hint="eastAsia" w:ascii="DejaVu Math TeX Gyre" w:hAnsi="DejaVu Math TeX Gyre" w:eastAsia="楷体" w:cs="Times New Roman"/>
-                <w:i w:val="0"/>
-                <w:sz w:val="28"/>
-                <w:szCs w:val="28"/>
-                <w:highlight w:val="none"/>
-                <w:lang w:eastAsia="zh-CN"/>
-              </w:rPr>
-            </m:ctrlPr>
-          </m:e>
-          <m:sub>
-            <m:r>
-              <m:rPr>
-                <m:sty m:val="p"/>
-              </m:rPr>
-              <w:rPr>
-                <w:rFonts w:hint="default" w:ascii="DejaVu Math TeX Gyre" w:hAnsi="DejaVu Math TeX Gyre" w:eastAsia="楷体" w:cs="Times New Roman"/>
-                <w:sz w:val="28"/>
-                <w:szCs w:val="28"/>
-                <w:highlight w:val="none"/>
-                <w:lang w:val="en-US" w:eastAsia="zh-CN"/>
-              </w:rPr>
-              <m:t>1</m:t>
-            </m:r>
-            <m:ctrlPr>
-              <w:rPr>
-                <w:rFonts w:hint="eastAsia" w:ascii="DejaVu Math TeX Gyre" w:hAnsi="DejaVu Math TeX Gyre" w:eastAsia="楷体" w:cs="Times New Roman"/>
-                <w:i w:val="0"/>
-                <w:sz w:val="28"/>
-                <w:szCs w:val="28"/>
-                <w:highlight w:val="none"/>
-                <w:lang w:eastAsia="zh-CN"/>
-              </w:rPr>
-            </m:ctrlPr>
-          </m:sub>
-        </m:sSub>
-      </m:oMath>
-      <w:r>
-        <w:rPr>
-          <w:rFonts w:hint="eastAsia" w:ascii="Times New Roman" w:hAnsi="Times New Roman" w:eastAsia="楷体" w:cs="Times New Roman"/>
-          <w:sz w:val="28"/>
-          <w:szCs w:val="28"/>
-        </w:rPr>
-        <w:t>−</w:t>
-      </w:r>
-      <m:oMath>
-        <m:sSub>
-          <m:sSubPr>
-            <m:ctrlPr>
-              <w:rPr>
-                <w:rFonts w:hint="eastAsia" w:ascii="DejaVu Math TeX Gyre" w:hAnsi="DejaVu Math TeX Gyre" w:eastAsia="楷体" w:cs="Times New Roman"/>
-                <w:i w:val="0"/>
-                <w:sz w:val="28"/>
-                <w:szCs w:val="28"/>
-                <w:highlight w:val="none"/>
-                <w:lang w:eastAsia="zh-CN"/>
-              </w:rPr>
-            </m:ctrlPr>
-          </m:sSubPr>
-          <m:e>
-            <m:r>
-              <m:rPr>
-                <m:sty m:val="p"/>
-              </m:rPr>
-              <w:rPr>
-                <w:rFonts w:hint="eastAsia" w:ascii="DejaVu Math TeX Gyre" w:hAnsi="DejaVu Math TeX Gyre" w:eastAsia="楷体" w:cs="Times New Roman"/>
-                <w:sz w:val="28"/>
-                <w:szCs w:val="28"/>
-                <w:highlight w:val="none"/>
-                <w:lang w:eastAsia="zh-CN"/>
-              </w:rPr>
-              <m:t>H</m:t>
-            </m:r>
-            <m:ctrlPr>
-              <w:rPr>
-                <w:rFonts w:hint="eastAsia" w:ascii="DejaVu Math TeX Gyre" w:hAnsi="DejaVu Math TeX Gyre" w:eastAsia="楷体" w:cs="Times New Roman"/>
-                <w:i w:val="0"/>
-                <w:sz w:val="28"/>
-                <w:szCs w:val="28"/>
-                <w:highlight w:val="none"/>
-                <w:lang w:eastAsia="zh-CN"/>
-              </w:rPr>
-            </m:ctrlPr>
-          </m:e>
-          <m:sub>
-            <m:r>
-              <m:rPr>
-                <m:sty m:val="p"/>
-              </m:rPr>
-              <w:rPr>
-                <w:rFonts w:hint="eastAsia" w:ascii="DejaVu Math TeX Gyre" w:hAnsi="DejaVu Math TeX Gyre" w:eastAsia="楷体" w:cs="Times New Roman"/>
-                <w:sz w:val="28"/>
-                <w:szCs w:val="28"/>
-                <w:highlight w:val="none"/>
-                <w:lang w:eastAsia="zh-CN"/>
-              </w:rPr>
-              <m:t>0</m:t>
-            </m:r>
-            <m:ctrlPr>
-              <w:rPr>
-                <w:rFonts w:hint="eastAsia" w:ascii="DejaVu Math TeX Gyre" w:hAnsi="DejaVu Math TeX Gyre" w:eastAsia="楷体" w:cs="Times New Roman"/>
-                <w:i w:val="0"/>
-                <w:sz w:val="28"/>
-                <w:szCs w:val="28"/>
-                <w:highlight w:val="none"/>
-                <w:lang w:eastAsia="zh-CN"/>
-              </w:rPr>
-            </m:ctrlPr>
-          </m:sub>
-        </m:sSub>
-      </m:oMath>
-      <w:r>
-        <w:rPr>
-          <w:rFonts w:hint="eastAsia" w:ascii="Times New Roman" w:hAnsi="Times New Roman" w:eastAsia="楷体" w:cs="Times New Roman"/>
-          <w:sz w:val="28"/>
-          <w:szCs w:val="28"/>
-        </w:rPr>
-        <w:t>)/</w:t>
-      </w:r>
-      <m:oMath>
-        <m:sSub>
-          <m:sSubPr>
-            <m:ctrlPr>
-              <w:rPr>
-                <w:rFonts w:hint="eastAsia" w:ascii="DejaVu Math TeX Gyre" w:hAnsi="DejaVu Math TeX Gyre" w:eastAsia="楷体" w:cs="Times New Roman"/>
-                <w:i w:val="0"/>
-                <w:sz w:val="28"/>
-                <w:szCs w:val="28"/>
-                <w:highlight w:val="none"/>
-                <w:lang w:eastAsia="zh-CN"/>
-              </w:rPr>
-            </m:ctrlPr>
-          </m:sSubPr>
-          <m:e>
-            <m:r>
-              <m:rPr>
-                <m:sty m:val="p"/>
-              </m:rPr>
-              <w:rPr>
-                <w:rFonts w:hint="eastAsia" w:ascii="DejaVu Math TeX Gyre" w:hAnsi="DejaVu Math TeX Gyre" w:eastAsia="楷体" w:cs="Times New Roman"/>
-                <w:sz w:val="28"/>
-                <w:szCs w:val="28"/>
-                <w:highlight w:val="none"/>
-                <w:lang w:eastAsia="zh-CN"/>
-              </w:rPr>
-              <m:t>H</m:t>
-            </m:r>
-            <m:ctrlPr>
-              <w:rPr>
-                <w:rFonts w:hint="eastAsia" w:ascii="DejaVu Math TeX Gyre" w:hAnsi="DejaVu Math TeX Gyre" w:eastAsia="楷体" w:cs="Times New Roman"/>
-                <w:i w:val="0"/>
-                <w:sz w:val="28"/>
-                <w:szCs w:val="28"/>
-                <w:highlight w:val="none"/>
-                <w:lang w:eastAsia="zh-CN"/>
-              </w:rPr>
-            </m:ctrlPr>
-          </m:e>
-          <m:sub>
-            <m:r>
-              <m:rPr>
-                <m:sty m:val="p"/>
-              </m:rPr>
-              <w:rPr>
-                <w:rFonts w:hint="eastAsia" w:ascii="DejaVu Math TeX Gyre" w:hAnsi="DejaVu Math TeX Gyre" w:eastAsia="楷体" w:cs="Times New Roman"/>
-                <w:sz w:val="28"/>
-                <w:szCs w:val="28"/>
-                <w:highlight w:val="none"/>
-                <w:lang w:eastAsia="zh-CN"/>
-              </w:rPr>
-              <m:t>0</m:t>
-            </m:r>
-            <m:ctrlPr>
-              <w:rPr>
-                <w:rFonts w:hint="eastAsia" w:ascii="DejaVu Math TeX Gyre" w:hAnsi="DejaVu Math TeX Gyre" w:eastAsia="楷体" w:cs="Times New Roman"/>
-                <w:i w:val="0"/>
-                <w:sz w:val="28"/>
-                <w:szCs w:val="28"/>
-                <w:highlight w:val="none"/>
-                <w:lang w:eastAsia="zh-CN"/>
-              </w:rPr>
-            </m:ctrlPr>
-          </m:sub>
-        </m:sSub>
-      </m:oMath>
-      <w:r>
-        <w:rPr>
-          <w:rFonts w:hint="eastAsia" w:ascii="Times New Roman" w:hAnsi="Times New Roman" w:eastAsia="楷体" w:cs="Times New Roman"/>
-          <w:sz w:val="28"/>
-          <w:szCs w:val="28"/>
-        </w:rPr>
-        <w:t>是否小于或等于15%，若是，将q+1赋值给q，返回步骤S32，继续按距跨中由近及远的顺序对称浇筑下一组尚未浇筑的非吊索区湿接缝；若否，则判定预设跨中区段浇筑完成，并进入步骤S4。</w:t>
-      </w:r>
-    </w:p>
-    <w:p>
-      <w:pPr>
-        <w:pStyle w:val="4"/>
-        <w:widowControl w:val="0"/>
-        <w:spacing w:line="500" w:lineRule="exact"/>
-        <w:ind w:firstLine="560" w:firstLineChars="200"/>
-        <w:jc w:val="both"/>
-        <w:rPr>
-          <w:rFonts w:hint="eastAsia" w:eastAsia="楷体" w:cs="Times New Roman"/>
-          <w:sz w:val="28"/>
-          <w:szCs w:val="28"/>
-        </w:rPr>
-      </w:pPr>
-      <w:r>
-        <w:rPr>
-          <w:rFonts w:hint="eastAsia" w:ascii="Times New Roman" w:hAnsi="Times New Roman" w:eastAsia="楷体" w:cs="Times New Roman"/>
-          <w:sz w:val="28"/>
-          <w:szCs w:val="28"/>
-        </w:rPr>
-        <w:t>4.根据权利要求3所述的悬索桥钢混组合梁原位叠合浇筑施工方法，其特征在于，所述S4中由跨中向两侧索塔对第i浇筑批次的所述非吊索区湿接缝进行逐批次、对称且跳仓浇筑包括以下步骤：</w:t>
+        <w:t>3.根据权利要求2所述的悬索桥钢混组合梁原位叠合浇筑施工方法，其特征在于，所述S4中由跨中向两侧索塔对第i浇筑批次的所述非吊索区湿接缝进行逐批次、对称且跳仓浇筑包括以下步骤：</w:t>
       </w:r>
     </w:p>
     <w:p>
@@ -2195,7 +2173,7 @@
           <w:sz w:val="28"/>
           <w:szCs w:val="28"/>
         </w:rPr>
-        <w:t>5.根据权利要求1所述的悬索桥钢混组合梁原位叠合浇筑施工方法，其特征在于，所述S6中，在所述第一阶段的湿接缝混凝土达到预设强度、且主缆线形达到预设指标后开始所述第二阶段浇筑；所述预设指标为：所述第一阶段连续三个浇筑批次中，每一批次结束后的跨中竖向位移变化量Δv均满足|Δv|≤3mm，且每一批次结束后的索塔塔顶纵向位移变化量均≤5mm。</w:t>
+        <w:t>4.根据权利要求1所述的悬索桥钢混组合梁原位叠合浇筑施工方法，其特征在于，所述S6中，在所述第一阶段的湿接缝混凝土达到预设强度、且主缆线形达到预设指标后开始所述第二阶段浇筑；所述预设指标为：所述第一阶段连续三个浇筑批次中，每一批次结束后的跨中竖向位移变化量Δv均满足|Δv|≤3mm，且每一批次结束后的索塔塔顶纵向位移变化量均≤5mm。</w:t>
       </w:r>
     </w:p>
     <w:p>
@@ -2217,7 +2195,7 @@
           <w:sz w:val="28"/>
           <w:szCs w:val="28"/>
         </w:rPr>
-        <w:t>6.根据权利要求1所述的悬索桥钢混组合梁原位叠合浇筑施工方法，其特征在于，所述S6中，在第N浇筑批次为所述第二阶段最末一批次之前，先执行以下步骤：</w:t>
+        <w:t>5.根据权利要求1所述的悬索桥钢混组合梁原位叠合浇筑施工方法，其特征在于，所述S6中，在第N浇筑批次为所述第二阶段最末一批次之前，先执行以下步骤：</w:t>
       </w:r>
     </w:p>
     <w:p>
@@ -2453,7 +2431,7 @@
           <w:sz w:val="28"/>
           <w:szCs w:val="28"/>
         </w:rPr>
-        <w:t>7.根据权利要求1所述的悬索桥钢混组合梁原位叠合浇筑施工方法，其特征在于，还包括以下步骤：</w:t>
+        <w:t>6.根据权利要求1所述的悬索桥钢混组合梁原位叠合浇筑施工方法，其特征在于，还包括以下步骤：</w:t>
       </w:r>
     </w:p>
     <w:p>
@@ -2946,7 +2924,7 @@
           <w:sz w:val="28"/>
           <w:szCs w:val="28"/>
         </w:rPr>
-        <w:t>8.根据权利要求7所述的悬索桥钢混组合梁原位叠合浇筑施工方法，其特征在于，所述预设阈值为L/10000，L为所述主缆跨度；在所述</w:t>
+        <w:t>7.根据权利要求6所述的悬索桥钢混组合梁原位叠合浇筑施工方法，其特征在于，所述预设阈值为L/10000，L为所述主缆跨度；在所述</w:t>
       </w:r>
       <m:oMath>
         <m:sSub>
@@ -3376,7 +3354,7 @@
           <w:sz w:val="28"/>
           <w:szCs w:val="28"/>
         </w:rPr>
-        <w:t>9.根据权利要求1至8中任一项所述的悬索桥钢混组合梁原位叠合浇筑施工方法，其特征在于，所述湿接缝混凝土的强度等级不低于所述预制混凝土桥面板的强度等级。</w:t>
+        <w:t>8.根据权利要求1至7中任一项所述的悬索桥钢混组合梁原位叠合浇筑施工方法，其特征在于，所述湿接缝混凝土的强度等级不低于所述预制混凝土桥面板的强度等级。</w:t>
       </w:r>
     </w:p>
     <w:p>
@@ -3398,7 +3376,7 @@
           <w:sz w:val="28"/>
           <w:szCs w:val="28"/>
         </w:rPr>
-        <w:t>10.根据权利要求2所述的悬索桥钢混组合梁原位叠合浇筑施工方法，其特征在于，所述预设范围为吊索中心线两侧各1.25m。</w:t>
+        <w:t>9.根据权利要求1所述的悬索桥钢混组合梁原位叠合浇筑施工方法，其特征在于，所述预设范围为吊索中心线两侧各1.25m。</w:t>
       </w:r>
     </w:p>
     <w:p>
@@ -3420,7 +3398,7 @@
           <w:sz w:val="28"/>
           <w:szCs w:val="28"/>
         </w:rPr>
-        <w:t>11.根据权利要求1所述的悬索桥钢混组合梁原位叠合浇筑施工方法，其特征在于，所述第一阶段分为10-12个浇筑批次完成，每一批次的浇筑方量与设计方量之差的绝对值不超过设计方量的5%。</w:t>
+        <w:t>10.根据权利要求1所述的悬索桥钢混组合梁原位叠合浇筑施工方法，其特征在于，所述第一阶段分为10-12个浇筑批次完成，每一批次的浇筑方量与设计方量之差的绝对值不超过设计方量的5%。</w:t>
       </w:r>
     </w:p>
     <w:p>
@@ -4006,7 +3984,7 @@
           <w:sz w:val="28"/>
           <w:szCs w:val="28"/>
         </w:rPr>
-        <w:t>S2、将所述湿接缝划分为吊索区湿接缝和其余非吊索区湿接缝；</w:t>
+        <w:t>S2、将所述湿接缝划分为吊索区湿接缝和其余非吊索区湿接缝；所述吊索区湿接缝为位于吊索中心线两侧预设范围内的湿接缝；所述非吊索区湿接缝为除所述吊索区湿接缝以外的湿接缝；</w:t>
       </w:r>
     </w:p>
     <w:p>
@@ -4028,7 +4006,7 @@
           <w:sz w:val="28"/>
           <w:szCs w:val="28"/>
         </w:rPr>
-        <w:t>S3、开始第一阶段浇筑，先浇筑预设跨中区段的所述非吊索区湿接缝；</w:t>
+        <w:t>S3、开始第一阶段浇筑，先浇筑预设跨中区段的所述非吊索区湿接缝；其中，所述跨中区段为以跨中为中心对称延伸的区段；</w:t>
       </w:r>
     </w:p>
     <w:p>
@@ -4050,7 +4028,7 @@
           <w:sz w:val="28"/>
           <w:szCs w:val="28"/>
         </w:rPr>
-        <w:t>S4、再由跨中向两侧索塔对第i浇筑批次的所述非吊索区湿接缝进行逐批次、对称且跳仓浇筑；其中，i为正整数，i的起始值为1；</w:t>
+        <w:t>S4、再由跨中向两侧索塔对第i浇筑批次的所述非吊索区湿接缝进行逐批次、对称且跳仓浇筑；其中，i为正整数，i的起始值为1；所述跳仓浇筑为沿纵桥向间隔至少一个吊索节段浇筑，所述吊索节段为相邻两吊索之间区段；</w:t>
       </w:r>
     </w:p>
     <w:p>
@@ -4117,28 +4095,6 @@
           <w:szCs w:val="28"/>
         </w:rPr>
         <w:t>S7、判断第N浇筑批次完成后是否仍存在尚未浇筑的吊索区湿接缝，若是，将N+1赋值给N，返回步骤S6中所述第二阶段浇筑；若否，全桥湿接缝浇筑完成并形成组合截面。</w:t>
-      </w:r>
-    </w:p>
-    <w:p>
-      <w:pPr>
-        <w:pStyle w:val="4"/>
-        <w:widowControl w:val="0"/>
-        <w:spacing w:line="500" w:lineRule="exact"/>
-        <w:ind w:firstLine="560" w:firstLineChars="200"/>
-        <w:jc w:val="both"/>
-        <w:rPr>
-          <w:rFonts w:hint="eastAsia" w:eastAsia="楷体" w:cs="Times New Roman"/>
-          <w:sz w:val="28"/>
-          <w:szCs w:val="28"/>
-        </w:rPr>
-      </w:pPr>
-      <w:r>
-        <w:rPr>
-          <w:rFonts w:hint="eastAsia" w:ascii="Times New Roman" w:hAnsi="Times New Roman" w:eastAsia="楷体" w:cs="Times New Roman"/>
-          <w:sz w:val="28"/>
-          <w:szCs w:val="28"/>
-        </w:rPr>
-        <w:t>进一步地，所述吊索区湿接缝为位于吊索中心线两侧预设范围内的湿接缝；所述非吊索区湿接缝为除所述吊索区湿接缝以外的湿接缝；所述跨中区段为以跨中为中心对称延伸的区段；所述跳仓浇筑为沿桥纵向间隔至少一个吊索节段浇筑，所述吊索节段为相邻两吊索之间区段。</w:t>
       </w:r>
     </w:p>
     <w:p>
@@ -7274,7 +7230,7 @@
           <w:sz w:val="28"/>
           <w:szCs w:val="28"/>
         </w:rPr>
-        <w:t>S2、将所述湿接缝划分为吊索区湿接缝和其余非吊索区湿接缝；</w:t>
+        <w:t>S2、将所述湿接缝划分为吊索区湿接缝和其余非吊索区湿接缝；所述吊索区湿接缝为位于吊索中心线两侧预设范围内的湿接缝；所述非吊索区湿接缝为除所述吊索区湿接缝以外的湿接缝；</w:t>
       </w:r>
     </w:p>
     <w:p>
@@ -7296,7 +7252,7 @@
           <w:sz w:val="28"/>
           <w:szCs w:val="28"/>
         </w:rPr>
-        <w:t>S3、开始第一阶段浇筑，先浇筑预设跨中区段的所述非吊索区湿接缝；</w:t>
+        <w:t>S3、开始第一阶段浇筑，先浇筑预设跨中区段的所述非吊索区湿接缝；其中，所述跨中区段为以跨中为中心对称延伸的区段；</w:t>
       </w:r>
     </w:p>
     <w:p>
@@ -7318,7 +7274,7 @@
           <w:sz w:val="28"/>
           <w:szCs w:val="28"/>
         </w:rPr>
-        <w:t>S4、再由跨中向两侧索塔对第i浇筑批次的所述非吊索区湿接缝进行逐批次、对称且跳仓浇筑；其中，i为正整数，i的起始值为1；</w:t>
+        <w:t>S4、再由跨中向两侧索塔对第i浇筑批次的所述非吊索区湿接缝进行逐批次、对称且跳仓浇筑；其中，i为正整数，i的起始值为1；所述跳仓浇筑为沿纵桥向间隔至少一个吊索节段浇筑，所述吊索节段为相邻两吊索之间区段；</w:t>
       </w:r>
     </w:p>
     <w:p>

</xml_diff>

<commit_message>
Align the specification abstract with S1-S7 i/N pour loops.
Rewrite the abstract to keep zone splitting, two-stage skip pouring, and the no-counterweight effect, while adding numbered i/N batches and return language. Restore subscript formula symbols in the claims text export.

Co-authored-by: 2427613265-ai <2427613265-ai@users.noreply.github.com>
</commit_message>
<xml_diff>
--- a/docs/PA26-1238-I-A_权利要求书优化稿.docx
+++ b/docs/PA26-1238-I-A_权利要求书优化稿.docx
@@ -190,7 +190,8 @@
           <w:highlight w:val="none"/>
           <w:lang w:val="en-US"/>
         </w:rPr>
-        <w:t>本发明涉及桥梁工程施工技术领域</w:t>
+        <w:t>本发明涉及桥梁工程施工技术领域，公开了一种悬索桥钢混组合梁原位叠合浇筑施工方法：将钢主梁节段吊装并纵向连接成连续钢梁骨架，铺设预制混凝土桥面板形成湿接缝，划分为吊索区湿接缝与非吊索区湿接缝；第一阶段先浇筑预设跨中区段的非吊索区湿接缝，再按第i浇筑批次由跨中向两侧索塔对称跳仓浇筑，所述跳仓浇筑为沿纵桥向间隔至少一个吊索节段，若未浇完则将i+1赋值给i并返回；待湿接缝混凝土达到预设强度后，第二阶段按第N浇筑批次对称浇筑吊索区湿接缝，若未浇完则将N+1赋值给N并返回，形成组合截面。该方法可在不设置外部等效配重的条件下改善主缆施工线形控制，并减轻吊点过早形成组合约束带来的不利受力影响。</w:t>
+        <w:tab/>
       </w:r>
       <w:r>
         <w:rPr>
@@ -200,7 +201,6 @@
           <w:highlight w:val="none"/>
           <w:lang w:val="en-US" w:eastAsia="zh-CN"/>
         </w:rPr>
-        <w:t>，公开了</w:t>
       </w:r>
       <w:r>
         <w:rPr>
@@ -210,7 +210,6 @@
           <w:highlight w:val="none"/>
           <w:lang w:val="en-US"/>
         </w:rPr>
-        <w:t>一种悬索桥钢混组合梁原位叠合浇筑施工方法：将钢主梁节段吊装并纵向连接成连续钢梁骨架，铺设预制混凝土桥面板并形成湿接缝；将湿接缝划分为吊索区湿接缝与非吊索区湿接缝；第一阶段先浇筑预设跨中区段的非吊索区湿接缝，再由跨中向两侧索塔逐批次、对称且跳仓浇筑其余非吊索区湿接缝；待湿接缝混凝土达到预设强度后，第二阶段由跨中向两侧索塔对称、逐批次浇筑吊索区湿接缝，形成组合截面。该方法可在不设置外部等效配重的条件下改善主缆施工线形控制，并减轻吊点过早形成组合约束带来的不利受力影响。</w:t>
       </w:r>
       <w:r>
         <w:rPr>
@@ -219,7 +218,6 @@
           <w:szCs w:val="28"/>
           <w:highlight w:val="none"/>
         </w:rPr>
-        <w:tab/>
       </w:r>
     </w:p>
     <w:p>

</xml_diff>

<commit_message>
Add Fig.2 zone coloring and Fig.3 skip-pour sequence to the specification.
Redraw the figure list and the embodiment so red hanger-zone joints and blue non-hanger-zone joints are defined, and the first-stage ten-batch midspan-to-tower skip pouring is described with D1–D65 hanger numbers.

Co-authored-by: 2427613265-ai <2427613265-ai@users.noreply.github.com>
</commit_message>
<xml_diff>
--- a/docs/PA26-1238-I-A_权利要求书优化稿.docx
+++ b/docs/PA26-1238-I-A_权利要求书优化稿.docx
@@ -6835,6 +6835,81 @@
     </w:p>
     <w:p>
       <w:pPr>
+        <w:adjustRightInd w:val="0"/>
+        <w:snapToGrid w:val="0"/>
+        <w:spacing w:line="500" w:lineRule="exact"/>
+        <w:ind w:firstLine="560" w:firstLineChars="200"/>
+        <w:rPr>
+          <w:rFonts w:hint="default" w:ascii="Times New Roman" w:hAnsi="Times New Roman" w:eastAsia="楷体" w:cs="Times New Roman"/>
+          <w:sz w:val="28"/>
+          <w:szCs w:val="28"/>
+          <w:highlight w:val="none"/>
+        </w:rPr>
+      </w:pPr>
+      <w:r>
+        <w:rPr>
+          <w:rFonts w:ascii="Times New Roman" w:hAnsi="Times New Roman"/>
+          <w:sz w:val="28"/>
+          <w:rFonts w:hint="default" w:ascii="Times New Roman" w:hAnsi="Times New Roman" w:eastAsia="楷体" w:cs="Times New Roman"/>
+          <w:sz w:val="28"/>
+          <w:szCs w:val="28"/>
+          <w:highlight w:val="none"/>
+        </w:rPr>
+        <w:t>图2为湿接缝分区示意图，图中红色填充表示吊索区湿接缝，蓝色填充表示非吊索区湿接缝。</w:t>
+      </w:r>
+    </w:p>
+    <w:p>
+      <w:pPr>
+        <w:adjustRightInd w:val="0"/>
+        <w:snapToGrid w:val="0"/>
+        <w:spacing w:line="500" w:lineRule="exact"/>
+        <w:ind w:firstLine="560" w:firstLineChars="200"/>
+        <w:rPr>
+          <w:rFonts w:hint="default" w:ascii="Times New Roman" w:hAnsi="Times New Roman" w:eastAsia="楷体" w:cs="Times New Roman"/>
+          <w:sz w:val="28"/>
+          <w:szCs w:val="28"/>
+          <w:highlight w:val="none"/>
+        </w:rPr>
+      </w:pPr>
+      <w:r>
+        <w:rPr>
+          <w:rFonts w:ascii="Times New Roman" w:hAnsi="Times New Roman"/>
+          <w:sz w:val="28"/>
+          <w:rFonts w:hint="default" w:ascii="Times New Roman" w:hAnsi="Times New Roman" w:eastAsia="楷体" w:cs="Times New Roman"/>
+          <w:sz w:val="28"/>
+          <w:szCs w:val="28"/>
+          <w:highlight w:val="none"/>
+        </w:rPr>
+        <w:t>图3为第一阶段非吊索区湿接缝浇筑次序示意图。</w:t>
+      </w:r>
+    </w:p>
+    <w:p>
+      <w:pPr>
+        <w:adjustRightInd w:val="0"/>
+        <w:snapToGrid w:val="0"/>
+        <w:spacing w:line="500" w:lineRule="exact"/>
+        <w:ind w:firstLine="560" w:firstLineChars="200"/>
+        <w:rPr>
+          <w:rFonts w:hint="default" w:ascii="Times New Roman" w:hAnsi="Times New Roman" w:eastAsia="楷体" w:cs="Times New Roman"/>
+          <w:sz w:val="28"/>
+          <w:szCs w:val="28"/>
+          <w:highlight w:val="none"/>
+        </w:rPr>
+      </w:pPr>
+      <w:r>
+        <w:rPr>
+          <w:rFonts w:ascii="Times New Roman" w:hAnsi="Times New Roman"/>
+          <w:sz w:val="28"/>
+          <w:rFonts w:hint="default" w:ascii="Times New Roman" w:hAnsi="Times New Roman" w:eastAsia="楷体" w:cs="Times New Roman"/>
+          <w:sz w:val="28"/>
+          <w:szCs w:val="28"/>
+          <w:highlight w:val="none"/>
+        </w:rPr>
+        <w:t>图3中，D1～D65为沿纵桥向依次布置的吊索编号，第1次～第10次表示第一阶段非吊索区湿接缝的浇筑批次。</w:t>
+      </w:r>
+    </w:p>
+    <w:p>
+      <w:pPr>
         <w:tabs>
           <w:tab w:val="left" w:pos="2880"/>
         </w:tabs>
@@ -7184,7 +7259,7 @@
           <w:sz w:val="28"/>
           <w:szCs w:val="28"/>
         </w:rPr>
-        <w:t>在本实施例中，如图1所示，一种悬索桥钢混组合梁原位叠合浇筑施工方法，包括以下步骤：</w:t>
+        <w:t>在本实施例中，如图1至图3所示，一种悬索桥钢混组合梁原位叠合浇筑施工方法，包括以下步骤：</w:t>
       </w:r>
     </w:p>
     <w:p>
@@ -7228,7 +7303,7 @@
           <w:sz w:val="28"/>
           <w:szCs w:val="28"/>
         </w:rPr>
-        <w:t>S2、将所述湿接缝划分为吊索区湿接缝和其余非吊索区湿接缝；所述吊索区湿接缝为位于吊索中心线两侧预设范围内的湿接缝；所述非吊索区湿接缝为除所述吊索区湿接缝以外的湿接缝；</w:t>
+        <w:t>S2、如图2所示，将所述湿接缝划分为吊索区湿接缝和其余非吊索区湿接缝；所述吊索区湿接缝为位于吊索中心线两侧预设范围内的湿接缝；所述非吊索区湿接缝为除所述吊索区湿接缝以外的湿接缝；</w:t>
       </w:r>
     </w:p>
     <w:p>
@@ -7250,7 +7325,7 @@
           <w:sz w:val="28"/>
           <w:szCs w:val="28"/>
         </w:rPr>
-        <w:t>S3、开始第一阶段浇筑，先浇筑预设跨中区段的所述非吊索区湿接缝；其中，所述跨中区段为以跨中为中心对称延伸的区段；</w:t>
+        <w:t>S3、开始第一阶段浇筑，如图3所示，先浇筑预设跨中区段的所述非吊索区湿接缝；其中，所述跨中区段为以跨中为中心对称延伸的区段；</w:t>
       </w:r>
     </w:p>
     <w:p>
@@ -7272,7 +7347,7 @@
           <w:sz w:val="28"/>
           <w:szCs w:val="28"/>
         </w:rPr>
-        <w:t>S4、再由跨中向两侧索塔对第i浇筑批次的所述非吊索区湿接缝进行逐批次、对称且跳仓浇筑；其中，i为正整数，i的起始值为1；所述跳仓浇筑为沿纵桥向间隔至少一个吊索节段浇筑，所述吊索节段为相邻两吊索之间区段；</w:t>
+        <w:t>S4、如图3所示，再由跨中向两侧索塔对第i浇筑批次的所述非吊索区湿接缝进行逐批次、对称且跳仓浇筑；其中，i为正整数，i的起始值为1；所述跳仓浇筑为沿纵桥向间隔至少一个吊索节段浇筑，所述吊索节段为相邻两吊索之间区段；</w:t>
       </w:r>
     </w:p>
     <w:p>
@@ -7316,7 +7391,7 @@
           <w:sz w:val="28"/>
           <w:szCs w:val="28"/>
         </w:rPr>
-        <w:t>S6、待所述第一阶段的湿接缝混凝土达到预设强度后，开始第二阶段浇筑，由跨中向两侧索塔对称浇筑第N浇筑批次的所述吊索区湿接缝；其中，N为正整数，N的起始值为1；</w:t>
+        <w:t>S6、待所述第一阶段的湿接缝混凝土达到预设强度后，开始第二阶段浇筑，由跨中向两侧索塔对称浇筑第N浇筑批次的图2中红色所示吊索区湿接缝；其中，N为正整数，N的起始值为1；</w:t>
       </w:r>
     </w:p>
     <w:p>
@@ -7643,50 +7718,14 @@
       </w:pPr>
       <w:r>
         <w:rPr>
+          <w:rFonts w:ascii="Times New Roman" w:hAnsi="Times New Roman"/>
+          <w:sz w:val="28"/>
           <w:rFonts w:hint="default" w:ascii="Times New Roman" w:hAnsi="Times New Roman" w:eastAsia="楷体" w:cs="Times New Roman"/>
           <w:sz w:val="28"/>
           <w:szCs w:val="28"/>
           <w:highlight w:val="none"/>
         </w:rPr>
-        <w:t>第一阶段仅浇筑非吊索区湿接缝，且不依赖水箱、砂袋等外部等效配重。先浇筑预设跨中区段</w:t>
-      </w:r>
-      <w:r>
-        <w:rPr>
-          <w:rFonts w:hint="eastAsia" w:eastAsia="楷体" w:cs="Times New Roman"/>
-          <w:sz w:val="28"/>
-          <w:szCs w:val="28"/>
-          <w:highlight w:val="none"/>
-          <w:lang w:eastAsia="zh-CN"/>
-        </w:rPr>
-        <w:t>，</w:t>
-      </w:r>
-      <w:r>
-        <w:rPr>
-          <w:rFonts w:hint="default" w:ascii="Times New Roman" w:hAnsi="Times New Roman" w:eastAsia="楷体" w:cs="Times New Roman"/>
-          <w:sz w:val="28"/>
-          <w:szCs w:val="28"/>
-          <w:highlight w:val="none"/>
-        </w:rPr>
-        <w:t>跨中加载使主缆产生可控下沉的同时提升水平张力。依托工程尺度的分析与监测表明，跨中非吊点区湿接缝优先浇筑完成后，主缆水平张力较浇筑前可提升，几何刚度相应同步提升，从而使后续加载引起的竖向位移响应减小，为后续两端浇筑建立更高的刚度基准。随后由跨中向两侧索塔对称、跳仓推进其余非吊索区浇筑：对称用于保持左右平衡、抑制塔偏与线形偏斜；跳仓（间隔至少一个吊索节段）用于避免连续区段同步硬化造成局部刚度突变和变形集中，并将荷载效应分散到多个施工段。两端区域加载时，可利用主缆变形影响线沿跨径正负交替的“波浪特性”：两端加载可在跨中产生约反向隆起效应，对前期跨中下沉形成补偿，使主缆线形向目标状态回归。由此，第一阶段形成跨中优先建立刚度</w:t>
-      </w:r>
-      <w:r>
-        <w:rPr>
-          <w:rFonts w:hint="eastAsia" w:eastAsia="楷体" w:cs="Times New Roman"/>
-          <w:sz w:val="28"/>
-          <w:szCs w:val="28"/>
-          <w:highlight w:val="none"/>
-          <w:lang w:eastAsia="zh-CN"/>
-        </w:rPr>
-        <w:t>，</w:t>
-      </w:r>
-      <w:r>
-        <w:rPr>
-          <w:rFonts w:hint="default" w:ascii="Times New Roman" w:hAnsi="Times New Roman" w:eastAsia="楷体" w:cs="Times New Roman"/>
-          <w:sz w:val="28"/>
-          <w:szCs w:val="28"/>
-          <w:highlight w:val="none"/>
-        </w:rPr>
-        <w:t>两端对称跳仓对消变形的自平衡过程。</w:t>
+        <w:t>如图2所示，预制混凝土桥面板铺设于连续钢梁骨架顶面后，相邻预制板之间形成纵、横湿接缝。图2中红色填充的湿接缝为吊索区湿接缝，位于吊索中心线两侧预设范围内、对应吊点附近的接缝区段；蓝色填充的湿接缝为非吊索区湿接缝，即除吊索区湿接缝以外的其余湿接缝。第一阶段仅浇筑图2中蓝色所示的非吊索区湿接缝；待其达到预设强度后，第二阶段再浇筑图2中红色所示的吊索区湿接缝，以推迟吊点附近组合约束的形成。</w:t>
       </w:r>
     </w:p>
     <w:p>
@@ -7708,7 +7747,91 @@
           <w:szCs w:val="28"/>
           <w:highlight w:val="none"/>
         </w:rPr>
-        <w:t>当判断第一阶段湿接缝混凝土已达到预设强度后，进入第二阶段，由跨中向两侧索塔对称、逐批次浇筑吊索区湿接缝。此时主缆线形已在前序自平衡过程中趋于稳定，再闭合吊点区接缝，有利于在接近目标线形的状态下完成组合约束，实现</w:t>
+        <w:t>第一阶段仅浇筑非吊索区湿接缝，且不依赖水箱、砂袋等外部等效配重。先浇筑预设跨中区段</w:t>
+      </w:r>
+      <w:r>
+        <w:rPr>
+          <w:rFonts w:hint="eastAsia" w:eastAsia="楷体" w:cs="Times New Roman"/>
+          <w:sz w:val="28"/>
+          <w:szCs w:val="28"/>
+          <w:highlight w:val="none"/>
+          <w:lang w:eastAsia="zh-CN"/>
+        </w:rPr>
+        <w:t>，</w:t>
+      </w:r>
+      <w:r>
+        <w:rPr>
+          <w:rFonts w:hint="default" w:ascii="Times New Roman" w:hAnsi="Times New Roman" w:eastAsia="楷体" w:cs="Times New Roman"/>
+          <w:sz w:val="28"/>
+          <w:szCs w:val="28"/>
+          <w:highlight w:val="none"/>
+        </w:rPr>
+        <w:t>跨中加载使主缆产生可控下沉的同时提升水平张力。依托工程尺度的分析与监测表明，跨中非吊点区湿接缝优先浇筑完成后，主缆水平张力较浇筑前可提升，几何刚度相应同步提升，从而使后续加载引起的竖向位移响应减小，为后续两端浇筑建立更高的刚度基准。随后由跨中向两侧索塔对称、跳仓推进其余非吊索区浇筑：对称用于保持左右平衡、抑制塔偏与线形偏斜；跳仓（间隔至少一个吊索节段）用于避免连续区段同步硬化造成局部刚度突变和变形集中，并将荷载效应分散到多个施工段。两端区域加载时，可利用主缆变形影响线沿跨径正负交替的“波浪特性”：两端加载可在跨中产生约反向隆起效应，对前期跨中下沉形成补偿，使主缆线形向目标状态回归。由此，第一阶段形成跨中优先建立刚度</w:t>
+      </w:r>
+      <w:r>
+        <w:rPr>
+          <w:rFonts w:hint="eastAsia" w:eastAsia="楷体" w:cs="Times New Roman"/>
+          <w:sz w:val="28"/>
+          <w:szCs w:val="28"/>
+          <w:highlight w:val="none"/>
+          <w:lang w:eastAsia="zh-CN"/>
+        </w:rPr>
+        <w:t>，</w:t>
+      </w:r>
+      <w:r>
+        <w:rPr>
+          <w:rFonts w:hint="default" w:ascii="Times New Roman" w:hAnsi="Times New Roman" w:eastAsia="楷体" w:cs="Times New Roman"/>
+          <w:sz w:val="28"/>
+          <w:szCs w:val="28"/>
+          <w:highlight w:val="none"/>
+        </w:rPr>
+        <w:t>两端对称跳仓对消变形的自平衡过程。</w:t>
+      </w:r>
+    </w:p>
+    <w:p>
+      <w:pPr>
+        <w:pStyle w:val="4"/>
+        <w:spacing w:line="500" w:lineRule="exact"/>
+        <w:ind w:firstLine="560" w:firstLineChars="200"/>
+        <w:rPr>
+          <w:rFonts w:hint="default" w:ascii="Times New Roman" w:hAnsi="Times New Roman" w:eastAsia="楷体" w:cs="Times New Roman"/>
+          <w:sz w:val="28"/>
+          <w:szCs w:val="28"/>
+          <w:highlight w:val="none"/>
+        </w:rPr>
+      </w:pPr>
+      <w:r>
+        <w:rPr>
+          <w:rFonts w:ascii="Times New Roman" w:hAnsi="Times New Roman"/>
+          <w:sz w:val="28"/>
+          <w:rFonts w:hint="default" w:ascii="Times New Roman" w:hAnsi="Times New Roman" w:eastAsia="楷体" w:cs="Times New Roman"/>
+          <w:sz w:val="28"/>
+          <w:szCs w:val="28"/>
+          <w:highlight w:val="none"/>
+        </w:rPr>
+        <w:t>如图3所示，第一阶段非吊索区湿接缝沿主缆跨径按第1次至第10次共十个浇筑批次组织施工，并关于跨中左右对称。图3中D1～D65为沿纵桥向依次布置的吊索编号。第1次对称布置于跨中附近，对应于步骤S3优先浇筑的预设跨中区段；第2次至第5次由跨中向两侧索塔方向依次外扩，且与相邻已浇批次沿纵桥向间隔至少一个吊索节段；第6次至第10次再由跨中向两侧索塔方向回填前述间隔仓位，同样保持左右对称。图3所示各次浇筑对象均为非吊索区湿接缝，对应于图2中的蓝色填充；吊索区湿接缝（图2中红色填充）不在第一阶段浇筑。该次序体现了跳仓浇筑：相邻浇筑批次沿纵桥向不连续推进，从而避免局部刚度突变，并在不设置外部等效配重的条件下，形成“先跨中建立刚度、后两端对称跳仓对消变形、再回填间隔仓”的自平衡过程。</w:t>
+      </w:r>
+    </w:p>
+    <w:p>
+      <w:pPr>
+        <w:pStyle w:val="4"/>
+        <w:spacing w:line="500" w:lineRule="exact"/>
+        <w:ind w:firstLine="560" w:firstLineChars="200"/>
+        <w:rPr>
+          <w:rFonts w:hint="default" w:ascii="Times New Roman" w:hAnsi="Times New Roman" w:eastAsia="楷体" w:cs="Times New Roman"/>
+          <w:sz w:val="28"/>
+          <w:szCs w:val="28"/>
+          <w:highlight w:val="none"/>
+        </w:rPr>
+      </w:pPr>
+      <w:r>
+        <w:rPr>
+          <w:rFonts w:hint="default" w:ascii="Times New Roman" w:hAnsi="Times New Roman" w:eastAsia="楷体" w:cs="Times New Roman"/>
+          <w:sz w:val="28"/>
+          <w:szCs w:val="28"/>
+          <w:highlight w:val="none"/>
+        </w:rPr>
+        <w:t>当判断第一阶段湿接缝混凝土已达到预设强度后，进入第二阶段，由跨中向两侧索塔对称、逐批次浇筑图2中红色所示的吊索区湿接缝。此时主缆线形已在前序自平衡过程中趋于稳定，再闭合吊点区接缝，有利于在接近目标线形的状态下完成组合约束，实现低应力锁定，减轻吊点硬约束过早介入带来的不利应力。待全桥湿接缝浇筑完成并硬化后，钢梁与预制桥面板形成组合截面，完成体系转换，后续二期恒载由组合截面共同承担。</w:t>
       </w:r>
       <w:r>
         <w:rPr>
@@ -7718,7 +7841,6 @@
           <w:highlight w:val="none"/>
           <w:lang w:val="en-US" w:eastAsia="zh-CN"/>
         </w:rPr>
-        <w:t>低</w:t>
       </w:r>
       <w:r>
         <w:rPr>
@@ -7727,7 +7849,6 @@
           <w:szCs w:val="28"/>
           <w:highlight w:val="none"/>
         </w:rPr>
-        <w:t>应力锁定，减轻吊点硬约束过早介入带来的不利应力。待全桥湿接缝浇筑完成并硬化后，钢梁与预制桥面板形成组合截面，完成体系转换，后续二期恒载由组合截面共同承担。</w:t>
       </w:r>
     </w:p>
     <w:p>
@@ -11383,7 +11504,7 @@
           <w:highlight w:val="none"/>
           <w:lang w:eastAsia="zh-CN"/>
         </w:rPr>
-        <w:t>具体而言，由此形成的吊索区总宽约2.5m，对应吊点附近需要滞后闭合的湿接缝范围。该宽度的作用是在第一阶段保留吊点处钢梁相对柔性，削减主缆曲率变化传入加劲梁的附加弯矩；待线形趋稳后再闭合，以利于</w:t>
+        <w:t>具体而言，由此形成的吊索区总宽约2.5m，对应吊点附近需要滞后闭合的湿接缝范围，即图2中红色填充所示区域。该宽度的作用是在第一阶段保留吊点处钢梁相对柔性，削减主缆曲率变化传入加劲梁的附加弯矩；待线形趋稳后再闭合，以利于减小应力。范围过窄，吊点硬约束消除不充分；过宽，则第一阶段可用于跨中优先加载与跳仓平衡的非吊索区偏少。1.25m可作为与常用吊索间距及接缝构造相匹配的取值，具体工程也可按设计微调。</w:t>
       </w:r>
       <w:r>
         <w:rPr>
@@ -11393,7 +11514,6 @@
           <w:highlight w:val="none"/>
           <w:lang w:val="en-US" w:eastAsia="zh-CN"/>
         </w:rPr>
-        <w:t>减小应力</w:t>
       </w:r>
       <w:r>
         <w:rPr>
@@ -11403,7 +11523,6 @@
           <w:highlight w:val="none"/>
           <w:lang w:eastAsia="zh-CN"/>
         </w:rPr>
-        <w:t>。范围过窄，吊点硬约束消除不充分；过宽，则第一阶段可用于跨中优先加载与跳仓平衡的非吊索区偏少。1.25m可作为与常用吊索间距及接缝构造相匹配的取值，具体工程也可按设计微调。</w:t>
       </w:r>
     </w:p>
     <w:p>
@@ -11493,7 +11612,7 @@
           <w:highlight w:val="none"/>
           <w:lang w:eastAsia="zh-CN"/>
         </w:rPr>
-        <w:t>具体而言，第一阶段批次划分过少，荷载接近连续推进，几何刚度提升与影响线对消难以分步形成；批次过多则组织成本上升。10–12批与主跨数百米至千米级、吊索节段数十个量级的工程相匹配，可使荷载增加→张力提升→后续变形抑制的过程阶梯推进。</w:t>
+        <w:t>具体而言，第一阶段批次划分过少，荷载接近连续推进，几何刚度提升与影响线对消难以分步形成；批次过多则组织成本上升。本实施例图3给出了第一阶段分为10个浇筑批次、左右对称施工的示例；10–12批与主跨数百米至千米级、吊索节段数十个量级的工程相匹配，可使荷载增加→张力提升→后续变形抑制的过程阶梯推进。</w:t>
       </w:r>
     </w:p>
     <w:p>
@@ -16600,6 +16719,144 @@
           <w:highlight w:val="none"/>
         </w:rPr>
         <w:t>图1</w:t>
+      </w:r>
+    </w:p>
+    <w:p>
+      <w:pPr>
+        <w:adjustRightInd w:val="0"/>
+        <w:snapToGrid w:val="0"/>
+        <w:spacing w:line="460" w:lineRule="atLeast"/>
+        <w:jc w:val="center"/>
+        <w:rPr>
+          <w:rFonts w:hint="default" w:ascii="Times New Roman" w:hAnsi="Times New Roman" w:eastAsia="楷体" w:cs="Times New Roman"/>
+          <w:sz w:val="28"/>
+          <w:szCs w:val="28"/>
+          <w:highlight w:val="none"/>
+        </w:rPr>
+      </w:pPr>
+      <w:r>
+        <w:drawing>
+          <wp:inline xmlns:a="http://schemas.openxmlformats.org/drawingml/2006/main" xmlns:pic="http://schemas.openxmlformats.org/drawingml/2006/picture">
+            <wp:extent cx="3240000" cy="3789153"/>
+            <wp:docPr id="9" name="Picture 9"/>
+            <wp:cNvGraphicFramePr>
+              <a:graphicFrameLocks noChangeAspect="1"/>
+            </wp:cNvGraphicFramePr>
+            <a:graphic>
+              <a:graphicData uri="http://schemas.openxmlformats.org/drawingml/2006/picture">
+                <pic:pic>
+                  <pic:nvPicPr>
+                    <pic:cNvPr id="0" name="图2_湿接缝分区.png"/>
+                    <pic:cNvPicPr/>
+                  </pic:nvPicPr>
+                  <pic:blipFill>
+                    <a:blip r:embed="rId19"/>
+                    <a:stretch>
+                      <a:fillRect/>
+                    </a:stretch>
+                  </pic:blipFill>
+                  <pic:spPr>
+                    <a:xfrm>
+                      <a:off x="0" y="0"/>
+                      <a:ext cx="3240000" cy="3789153"/>
+                    </a:xfrm>
+                    <a:prstGeom prst="rect"/>
+                  </pic:spPr>
+                </pic:pic>
+              </a:graphicData>
+            </a:graphic>
+          </wp:inline>
+        </w:drawing>
+      </w:r>
+    </w:p>
+    <w:p>
+      <w:pPr>
+        <w:adjustRightInd w:val="0"/>
+        <w:snapToGrid w:val="0"/>
+        <w:spacing w:line="460" w:lineRule="atLeast"/>
+        <w:jc w:val="center"/>
+        <w:rPr>
+          <w:rFonts w:hint="default" w:ascii="Times New Roman" w:hAnsi="Times New Roman" w:eastAsia="楷体" w:cs="Times New Roman"/>
+          <w:sz w:val="28"/>
+          <w:szCs w:val="28"/>
+          <w:highlight w:val="none"/>
+        </w:rPr>
+      </w:pPr>
+      <w:r>
+        <w:rPr>
+          <w:rFonts w:ascii="Times New Roman" w:hAnsi="Times New Roman" w:eastAsia="楷体"/>
+          <w:sz w:val="28"/>
+        </w:rPr>
+        <w:t>图2</w:t>
+      </w:r>
+    </w:p>
+    <w:p>
+      <w:pPr>
+        <w:adjustRightInd w:val="0"/>
+        <w:snapToGrid w:val="0"/>
+        <w:spacing w:line="460" w:lineRule="atLeast"/>
+        <w:jc w:val="center"/>
+        <w:rPr>
+          <w:rFonts w:hint="default" w:ascii="Times New Roman" w:hAnsi="Times New Roman" w:eastAsia="楷体" w:cs="Times New Roman"/>
+          <w:sz w:val="28"/>
+          <w:szCs w:val="28"/>
+          <w:highlight w:val="none"/>
+        </w:rPr>
+      </w:pPr>
+      <w:r>
+        <w:drawing>
+          <wp:inline xmlns:a="http://schemas.openxmlformats.org/drawingml/2006/main" xmlns:pic="http://schemas.openxmlformats.org/drawingml/2006/picture">
+            <wp:extent cx="5760000" cy="1520165"/>
+            <wp:docPr id="8" name="Picture 8"/>
+            <wp:cNvGraphicFramePr>
+              <a:graphicFrameLocks noChangeAspect="1"/>
+            </wp:cNvGraphicFramePr>
+            <a:graphic>
+              <a:graphicData uri="http://schemas.openxmlformats.org/drawingml/2006/picture">
+                <pic:pic>
+                  <pic:nvPicPr>
+                    <pic:cNvPr id="0" name="图3_第一阶段浇筑次序.png"/>
+                    <pic:cNvPicPr/>
+                  </pic:nvPicPr>
+                  <pic:blipFill>
+                    <a:blip r:embed="rId18"/>
+                    <a:stretch>
+                      <a:fillRect/>
+                    </a:stretch>
+                  </pic:blipFill>
+                  <pic:spPr>
+                    <a:xfrm>
+                      <a:off x="0" y="0"/>
+                      <a:ext cx="5760000" cy="1520165"/>
+                    </a:xfrm>
+                    <a:prstGeom prst="rect"/>
+                  </pic:spPr>
+                </pic:pic>
+              </a:graphicData>
+            </a:graphic>
+          </wp:inline>
+        </w:drawing>
+      </w:r>
+    </w:p>
+    <w:p>
+      <w:pPr>
+        <w:adjustRightInd w:val="0"/>
+        <w:snapToGrid w:val="0"/>
+        <w:spacing w:line="460" w:lineRule="atLeast"/>
+        <w:jc w:val="center"/>
+        <w:rPr>
+          <w:rFonts w:hint="default" w:ascii="Times New Roman" w:hAnsi="Times New Roman" w:eastAsia="楷体" w:cs="Times New Roman"/>
+          <w:sz w:val="28"/>
+          <w:szCs w:val="28"/>
+          <w:highlight w:val="none"/>
+        </w:rPr>
+      </w:pPr>
+      <w:r>
+        <w:rPr>
+          <w:rFonts w:ascii="Times New Roman" w:hAnsi="Times New Roman" w:eastAsia="楷体"/>
+          <w:sz w:val="28"/>
+        </w:rPr>
+        <w:t>图3</w:t>
       </w:r>
     </w:p>
     <w:p>

</xml_diff>